<commit_message>
feat: add frontend documentation for dental AI portal, detailing architecture and functionality
</commit_message>
<xml_diff>
--- a/entrenamiento ia/Documentación de pruebas/comparacion_resultados.docx
+++ b/entrenamiento ia/Documentación de pruebas/comparacion_resultados.docx
@@ -45,7 +45,7 @@
       </w:r>
       <w:r>
         <w:rPr>
-          <w:rStyle w:val="Textooriginal"/>
+          <w:rStyle w:val="Textooriginaluser"/>
         </w:rPr>
         <w:t>results.csv</w:t>
       </w:r>
@@ -129,7 +129,7 @@
       </w:r>
       <w:r>
         <w:rPr>
-          <w:rStyle w:val="Textooriginal"/>
+          <w:rStyle w:val="Textooriginaluser"/>
         </w:rPr>
         <w:t>dental_yolo26n_laptop</w:t>
       </w:r>
@@ -149,7 +149,7 @@
       </w:r>
       <w:r>
         <w:rPr>
-          <w:rStyle w:val="Textooriginal"/>
+          <w:rStyle w:val="Textooriginaluser"/>
         </w:rPr>
         <w:t>dental_yolov8</w:t>
       </w:r>
@@ -205,7 +205,7 @@
       </w:r>
       <w:r>
         <w:rPr>
-          <w:rStyle w:val="Textooriginal"/>
+          <w:rStyle w:val="Textooriginaluser"/>
         </w:rPr>
         <w:t>--freeze 10</w:t>
       </w:r>
@@ -271,7 +271,7 @@
       </w:r>
       <w:r>
         <w:rPr>
-          <w:rStyle w:val="Textooriginal"/>
+          <w:rStyle w:val="Textooriginaluser"/>
         </w:rPr>
         <w:t>dental_yolov8</w:t>
       </w:r>
@@ -388,7 +388,7 @@
       </w:r>
       <w:r>
         <w:rPr>
-          <w:rStyle w:val="Textooriginal"/>
+          <w:rStyle w:val="Textooriginaluser"/>
         </w:rPr>
         <w:t>--freeze 10</w:t>
       </w:r>
@@ -398,7 +398,7 @@
       </w:r>
       <w:r>
         <w:rPr>
-          <w:rStyle w:val="Textooriginal"/>
+          <w:rStyle w:val="Textooriginaluser"/>
         </w:rPr>
         <w:t>--freeze 5</w:t>
       </w:r>
@@ -523,7 +523,7 @@
       </w:r>
       <w:r>
         <w:rPr>
-          <w:rStyle w:val="Textooriginal"/>
+          <w:rStyle w:val="Textooriginaluser"/>
         </w:rPr>
         <w:t>freeze 5</w:t>
       </w:r>
@@ -554,7 +554,7 @@
       </w:r>
       <w:r>
         <w:rPr>
-          <w:rStyle w:val="Textooriginal"/>
+          <w:rStyle w:val="Textooriginaluser"/>
         </w:rPr>
         <w:t>freeze 10</w:t>
       </w:r>
@@ -564,7 +564,7 @@
       </w:r>
       <w:r>
         <w:rPr>
-          <w:rStyle w:val="Textooriginal"/>
+          <w:rStyle w:val="Textooriginaluser"/>
         </w:rPr>
         <w:t>freeze 5</w:t>
       </w:r>
@@ -899,7 +899,7 @@
       </w:r>
       <w:r>
         <w:rPr>
-          <w:rStyle w:val="Textooriginal"/>
+          <w:rStyle w:val="Textooriginaluser"/>
         </w:rPr>
         <w:t>freeze 10</w:t>
       </w:r>
@@ -949,7 +949,7 @@
       </w:r>
       <w:r>
         <w:rPr>
-          <w:rStyle w:val="Textooriginal"/>
+          <w:rStyle w:val="Textooriginaluser"/>
         </w:rPr>
         <w:t>dental_yolo26n_laptop_freeze5\weights\best.pt</w:t>
       </w:r>
@@ -993,7 +993,7 @@
       </w:r>
       <w:r>
         <w:rPr>
-          <w:rStyle w:val="Textooriginal"/>
+          <w:rStyle w:val="Textooriginaluser"/>
         </w:rPr>
         <w:t>DOCUMENTACION_ENTRENAMIENTO_IA.md</w:t>
       </w:r>
@@ -1003,7 +1003,7 @@
       </w:r>
       <w:r>
         <w:rPr>
-          <w:rStyle w:val="Textooriginal"/>
+          <w:rStyle w:val="Textooriginaluser"/>
         </w:rPr>
         <w:t>--freeze 5</w:t>
       </w:r>
@@ -1060,7 +1060,7 @@
       </w:r>
       <w:r>
         <w:rPr>
-          <w:rStyle w:val="Textooriginal"/>
+          <w:rStyle w:val="Textooriginaluser"/>
         </w:rPr>
         <w:t>train_yolov8.py</w:t>
       </w:r>
@@ -1122,7 +1122,7 @@
       </w:r>
       <w:r>
         <w:rPr>
-          <w:rStyle w:val="Textooriginal"/>
+          <w:rStyle w:val="Textooriginaluser"/>
         </w:rPr>
         <w:t>lr0=0.01</w:t>
       </w:r>
@@ -1167,7 +1167,7 @@
       </w:r>
       <w:r>
         <w:rPr>
-          <w:rStyle w:val="Textooriginal"/>
+          <w:rStyle w:val="Textooriginaluser"/>
         </w:rPr>
         <w:t>--freeze</w:t>
       </w:r>
@@ -1177,7 +1177,7 @@
       </w:r>
       <w:r>
         <w:rPr>
-          <w:rStyle w:val="Textooriginal"/>
+          <w:rStyle w:val="Textooriginaluser"/>
         </w:rPr>
         <w:t>lr0</w:t>
       </w:r>
@@ -1188,7 +1188,7 @@
     </w:p>
     <w:p>
       <w:pPr>
-        <w:pStyle w:val="Textopreformateado"/>
+        <w:pStyle w:val="Textopreformateadouser"/>
         <w:numPr>
           <w:ilvl w:val="0"/>
           <w:numId w:val="0"/>
@@ -1212,7 +1212,7 @@
     </w:p>
     <w:p>
       <w:pPr>
-        <w:pStyle w:val="Textopreformateado"/>
+        <w:pStyle w:val="Textopreformateadouser"/>
         <w:numPr>
           <w:ilvl w:val="0"/>
           <w:numId w:val="0"/>
@@ -1266,7 +1266,7 @@
       </w:r>
       <w:r>
         <w:rPr>
-          <w:rStyle w:val="Textooriginal"/>
+          <w:rStyle w:val="Textooriginaluser"/>
         </w:rPr>
         <w:t>train_yolov8.py</w:t>
       </w:r>
@@ -1276,7 +1276,7 @@
       </w:r>
       <w:r>
         <w:rPr>
-          <w:rStyle w:val="Textooriginal"/>
+          <w:rStyle w:val="Textooriginaluser"/>
         </w:rPr>
         <w:t>--dropout</w:t>
       </w:r>
@@ -1286,7 +1286,7 @@
       </w:r>
       <w:r>
         <w:rPr>
-          <w:rStyle w:val="Textooriginal"/>
+          <w:rStyle w:val="Textooriginaluser"/>
         </w:rPr>
         <w:t>--weight-decay</w:t>
       </w:r>
@@ -1374,7 +1374,7 @@
     </w:p>
     <w:p>
       <w:pPr>
-        <w:pStyle w:val="Textopreformateado"/>
+        <w:pStyle w:val="Textopreformateadouser"/>
         <w:numPr>
           <w:ilvl w:val="0"/>
           <w:numId w:val="0"/>
@@ -1398,7 +1398,7 @@
     </w:p>
     <w:p>
       <w:pPr>
-        <w:pStyle w:val="Textopreformateado"/>
+        <w:pStyle w:val="Textopreformateadouser"/>
         <w:numPr>
           <w:ilvl w:val="0"/>
           <w:numId w:val="0"/>
@@ -1477,7 +1477,7 @@
       </w:r>
       <w:r>
         <w:rPr>
-          <w:rStyle w:val="Textooriginal"/>
+          <w:rStyle w:val="Textooriginaluser"/>
         </w:rPr>
         <w:t>imgsz</w:t>
       </w:r>
@@ -1487,7 +1487,7 @@
       </w:r>
       <w:r>
         <w:rPr>
-          <w:rStyle w:val="Textooriginal"/>
+          <w:rStyle w:val="Textooriginaluser"/>
         </w:rPr>
         <w:t>batch</w:t>
       </w:r>
@@ -1498,7 +1498,7 @@
     </w:p>
     <w:p>
       <w:pPr>
-        <w:pStyle w:val="Textopreformateado"/>
+        <w:pStyle w:val="Textopreformateadouser"/>
         <w:numPr>
           <w:ilvl w:val="0"/>
           <w:numId w:val="0"/>
@@ -1522,7 +1522,7 @@
     </w:p>
     <w:p>
       <w:pPr>
-        <w:pStyle w:val="Textopreformateado"/>
+        <w:pStyle w:val="Textopreformateadouser"/>
         <w:numPr>
           <w:ilvl w:val="0"/>
           <w:numId w:val="0"/>
@@ -1572,7 +1572,7 @@
       </w:r>
       <w:r>
         <w:rPr>
-          <w:rStyle w:val="Textooriginal"/>
+          <w:rStyle w:val="Textooriginaluser"/>
         </w:rPr>
         <w:t>mAP50</w:t>
       </w:r>
@@ -1628,7 +1628,7 @@
       </w:r>
       <w:r>
         <w:rPr>
-          <w:rStyle w:val="Textooriginal"/>
+          <w:rStyle w:val="Textooriginaluser"/>
         </w:rPr>
         <w:t>resultado_cmd_02.txt</w:t>
       </w:r>
@@ -1638,7 +1638,7 @@
       </w:r>
       <w:r>
         <w:rPr>
-          <w:rStyle w:val="Textooriginal"/>
+          <w:rStyle w:val="Textooriginaluser"/>
         </w:rPr>
         <w:t>05.txt</w:t>
       </w:r>
@@ -1648,7 +1648,7 @@
       </w:r>
       <w:r>
         <w:rPr>
-          <w:rStyle w:val="Textooriginal"/>
+          <w:rStyle w:val="Textooriginaluser"/>
         </w:rPr>
         <w:t>best.pt</w:t>
       </w:r>
@@ -1688,7 +1688,7 @@
           </w:tcPr>
           <w:p>
             <w:pPr>
-              <w:pStyle w:val="Ttulodelatabla"/>
+              <w:pStyle w:val="Ttulodelatablauser"/>
               <w:ind w:hanging="0" w:start="0" w:end="0"/>
               <w:rPr/>
             </w:pPr>
@@ -1706,7 +1706,7 @@
           </w:tcPr>
           <w:p>
             <w:pPr>
-              <w:pStyle w:val="Ttulodelatabla"/>
+              <w:pStyle w:val="Ttulodelatablauser"/>
               <w:ind w:hanging="0" w:start="0" w:end="0"/>
               <w:rPr/>
             </w:pPr>
@@ -1724,7 +1724,7 @@
           </w:tcPr>
           <w:p>
             <w:pPr>
-              <w:pStyle w:val="Ttulodelatabla"/>
+              <w:pStyle w:val="Ttulodelatablauser"/>
               <w:ind w:hanging="0" w:start="0" w:end="0"/>
               <w:rPr/>
             </w:pPr>
@@ -1742,7 +1742,7 @@
           </w:tcPr>
           <w:p>
             <w:pPr>
-              <w:pStyle w:val="Ttulodelatabla"/>
+              <w:pStyle w:val="Ttulodelatablauser"/>
               <w:ind w:hanging="0" w:start="0" w:end="0"/>
               <w:rPr/>
             </w:pPr>
@@ -1763,7 +1763,7 @@
           </w:tcPr>
           <w:p>
             <w:pPr>
-              <w:pStyle w:val="Contenidodelatabla"/>
+              <w:pStyle w:val="Contenidodelatablauser"/>
               <w:ind w:hanging="0" w:start="0" w:end="0"/>
               <w:rPr/>
             </w:pPr>
@@ -1775,7 +1775,7 @@
             </w:r>
             <w:r>
               <w:rPr>
-                <w:rStyle w:val="Textooriginal"/>
+                <w:rStyle w:val="Textooriginaluser"/>
               </w:rPr>
               <w:t>dental_yolo26n_laptop_freeze5</w:t>
             </w:r>
@@ -1789,7 +1789,7 @@
           </w:tcPr>
           <w:p>
             <w:pPr>
-              <w:pStyle w:val="Contenidodelatabla"/>
+              <w:pStyle w:val="Contenidodelatablauser"/>
               <w:ind w:hanging="0" w:start="0" w:end="0"/>
               <w:rPr/>
             </w:pPr>
@@ -1807,7 +1807,7 @@
           </w:tcPr>
           <w:p>
             <w:pPr>
-              <w:pStyle w:val="Contenidodelatabla"/>
+              <w:pStyle w:val="Contenidodelatablauser"/>
               <w:ind w:hanging="0" w:start="0" w:end="0"/>
               <w:rPr/>
             </w:pPr>
@@ -1825,7 +1825,7 @@
           </w:tcPr>
           <w:p>
             <w:pPr>
-              <w:pStyle w:val="Contenidodelatabla"/>
+              <w:pStyle w:val="Contenidodelatablauser"/>
               <w:ind w:hanging="0" w:start="0" w:end="0"/>
               <w:rPr/>
             </w:pPr>
@@ -1846,7 +1846,7 @@
           </w:tcPr>
           <w:p>
             <w:pPr>
-              <w:pStyle w:val="Contenidodelatabla"/>
+              <w:pStyle w:val="Contenidodelatablauser"/>
               <w:ind w:hanging="0" w:start="0" w:end="0"/>
               <w:rPr/>
             </w:pPr>
@@ -1858,7 +1858,7 @@
             </w:r>
             <w:r>
               <w:rPr>
-                <w:rStyle w:val="Textooriginal"/>
+                <w:rStyle w:val="Textooriginaluser"/>
               </w:rPr>
               <w:t>dental_nofreeze_suave</w:t>
             </w:r>
@@ -1872,7 +1872,7 @@
           </w:tcPr>
           <w:p>
             <w:pPr>
-              <w:pStyle w:val="Contenidodelatabla"/>
+              <w:pStyle w:val="Contenidodelatablauser"/>
               <w:ind w:hanging="0" w:start="0" w:end="0"/>
               <w:rPr/>
             </w:pPr>
@@ -1892,7 +1892,7 @@
           </w:tcPr>
           <w:p>
             <w:pPr>
-              <w:pStyle w:val="Contenidodelatabla"/>
+              <w:pStyle w:val="Contenidodelatablauser"/>
               <w:ind w:hanging="0" w:start="0" w:end="0"/>
               <w:rPr/>
             </w:pPr>
@@ -1912,7 +1912,7 @@
           </w:tcPr>
           <w:p>
             <w:pPr>
-              <w:pStyle w:val="Contenidodelatabla"/>
+              <w:pStyle w:val="Contenidodelatablauser"/>
               <w:ind w:hanging="0" w:start="0" w:end="0"/>
               <w:rPr/>
             </w:pPr>
@@ -1933,7 +1933,7 @@
           </w:tcPr>
           <w:p>
             <w:pPr>
-              <w:pStyle w:val="Contenidodelatabla"/>
+              <w:pStyle w:val="Contenidodelatablauser"/>
               <w:ind w:hanging="0" w:start="0" w:end="0"/>
               <w:rPr/>
             </w:pPr>
@@ -1945,7 +1945,7 @@
             </w:r>
             <w:r>
               <w:rPr>
-                <w:rStyle w:val="Textooriginal"/>
+                <w:rStyle w:val="Textooriginaluser"/>
               </w:rPr>
               <w:t>dental_regularizado</w:t>
             </w:r>
@@ -1959,7 +1959,7 @@
           </w:tcPr>
           <w:p>
             <w:pPr>
-              <w:pStyle w:val="Contenidodelatabla"/>
+              <w:pStyle w:val="Contenidodelatablauser"/>
               <w:ind w:hanging="0" w:start="0" w:end="0"/>
               <w:rPr/>
             </w:pPr>
@@ -1977,7 +1977,7 @@
           </w:tcPr>
           <w:p>
             <w:pPr>
-              <w:pStyle w:val="Contenidodelatabla"/>
+              <w:pStyle w:val="Contenidodelatablauser"/>
               <w:ind w:hanging="0" w:start="0" w:end="0"/>
               <w:rPr/>
             </w:pPr>
@@ -1995,7 +1995,7 @@
           </w:tcPr>
           <w:p>
             <w:pPr>
-              <w:pStyle w:val="Contenidodelatabla"/>
+              <w:pStyle w:val="Contenidodelatablauser"/>
               <w:ind w:hanging="0" w:start="0" w:end="0"/>
               <w:rPr/>
             </w:pPr>
@@ -2016,7 +2016,7 @@
           </w:tcPr>
           <w:p>
             <w:pPr>
-              <w:pStyle w:val="Contenidodelatabla"/>
+              <w:pStyle w:val="Contenidodelatablauser"/>
               <w:ind w:hanging="0" w:start="0" w:end="0"/>
               <w:rPr/>
             </w:pPr>
@@ -2028,7 +2028,7 @@
             </w:r>
             <w:r>
               <w:rPr>
-                <w:rStyle w:val="Textooriginal"/>
+                <w:rStyle w:val="Textooriginaluser"/>
               </w:rPr>
               <w:t>dental_alta_resolucion</w:t>
             </w:r>
@@ -2042,7 +2042,7 @@
           </w:tcPr>
           <w:p>
             <w:pPr>
-              <w:pStyle w:val="Contenidodelatabla"/>
+              <w:pStyle w:val="Contenidodelatablauser"/>
               <w:ind w:hanging="0" w:start="0" w:end="0"/>
               <w:rPr/>
             </w:pPr>
@@ -2060,7 +2060,7 @@
           </w:tcPr>
           <w:p>
             <w:pPr>
-              <w:pStyle w:val="Contenidodelatabla"/>
+              <w:pStyle w:val="Contenidodelatablauser"/>
               <w:ind w:hanging="0" w:start="0" w:end="0"/>
               <w:rPr/>
             </w:pPr>
@@ -2078,7 +2078,7 @@
           </w:tcPr>
           <w:p>
             <w:pPr>
-              <w:pStyle w:val="Contenidodelatabla"/>
+              <w:pStyle w:val="Contenidodelatablauser"/>
               <w:rPr/>
             </w:pPr>
             <w:r>
@@ -2145,7 +2145,7 @@
       </w:r>
       <w:r>
         <w:rPr>
-          <w:rStyle w:val="Textooriginal"/>
+          <w:rStyle w:val="Textooriginaluser"/>
         </w:rPr>
         <w:t>dental_nofreeze_suave</w:t>
       </w:r>
@@ -2155,7 +2155,7 @@
       </w:r>
       <w:r>
         <w:rPr>
-          <w:rStyle w:val="Textooriginal"/>
+          <w:rStyle w:val="Textooriginaluser"/>
         </w:rPr>
         <w:t>freeze=0</w:t>
       </w:r>
@@ -2175,7 +2175,7 @@
       </w:r>
       <w:r>
         <w:rPr>
-          <w:rStyle w:val="Textooriginal"/>
+          <w:rStyle w:val="Textooriginaluser"/>
         </w:rPr>
         <w:t>0.0005</w:t>
       </w:r>
@@ -2205,7 +2205,7 @@
       </w:r>
       <w:r>
         <w:rPr>
-          <w:rStyle w:val="Textooriginal"/>
+          <w:rStyle w:val="Textooriginaluser"/>
         </w:rPr>
         <w:t>0.0005</w:t>
       </w:r>
@@ -2278,7 +2278,7 @@
       </w:r>
       <w:r>
         <w:rPr>
-          <w:rStyle w:val="Textooriginal"/>
+          <w:rStyle w:val="Textooriginaluser"/>
         </w:rPr>
         <w:t>dental_alta_resolucion</w:t>
       </w:r>
@@ -2294,7 +2294,7 @@
       </w:r>
       <w:r>
         <w:rPr>
-          <w:rStyle w:val="Textooriginal"/>
+          <w:rStyle w:val="Textooriginaluser"/>
         </w:rPr>
         <w:t>1024</w:t>
       </w:r>
@@ -2304,7 +2304,7 @@
       </w:r>
       <w:r>
         <w:rPr>
-          <w:rStyle w:val="Textooriginal"/>
+          <w:rStyle w:val="Textooriginaluser"/>
         </w:rPr>
         <w:t>mAP50-95</w:t>
       </w:r>
@@ -2380,7 +2380,7 @@
       </w:r>
       <w:r>
         <w:rPr>
-          <w:rStyle w:val="Textooriginal"/>
+          <w:rStyle w:val="Textooriginaluser"/>
         </w:rPr>
         <w:t>dental_regularizado</w:t>
       </w:r>
@@ -2421,7 +2421,7 @@
       </w:r>
       <w:r>
         <w:rPr>
-          <w:rStyle w:val="Textooriginal"/>
+          <w:rStyle w:val="Textooriginaluser"/>
         </w:rPr>
         <w:t>dental_nofreeze_suave</w:t>
       </w:r>
@@ -2431,7 +2431,7 @@
       </w:r>
       <w:r>
         <w:rPr>
-          <w:rStyle w:val="Textooriginal"/>
+          <w:rStyle w:val="Textooriginaluser"/>
         </w:rPr>
         <w:t>dental_alta_resolucion</w:t>
       </w:r>
@@ -2462,7 +2462,7 @@
       </w:r>
       <w:r>
         <w:rPr>
-          <w:rStyle w:val="Textooriginal"/>
+          <w:rStyle w:val="Textooriginaluser"/>
         </w:rPr>
         <w:t>imgsz=1024</w:t>
       </w:r>
@@ -2474,7 +2474,7 @@
       </w:r>
       <w:r>
         <w:rPr>
-          <w:rStyle w:val="Textooriginal"/>
+          <w:rStyle w:val="Textooriginaluser"/>
         </w:rPr>
         <w:t>freeze=0</w:t>
       </w:r>
@@ -2486,7 +2486,7 @@
       </w:r>
       <w:r>
         <w:rPr>
-          <w:rStyle w:val="Textooriginal"/>
+          <w:rStyle w:val="Textooriginaluser"/>
         </w:rPr>
         <w:t>lr0=0.0005</w:t>
       </w:r>
@@ -2579,7 +2579,7 @@
       </w:r>
       <w:r>
         <w:rPr>
-          <w:rStyle w:val="Textooriginaluser"/>
+          <w:rStyle w:val="Textooriginal"/>
         </w:rPr>
         <w:t>results.csv</w:t>
       </w:r>
@@ -2630,7 +2630,7 @@
           </w:tcPr>
           <w:p>
             <w:pPr>
-              <w:pStyle w:val="Ttulodelatablauser"/>
+              <w:pStyle w:val="Ttulodelatabla"/>
               <w:ind w:hanging="0" w:start="0" w:end="0"/>
               <w:rPr/>
             </w:pPr>
@@ -2648,7 +2648,7 @@
           </w:tcPr>
           <w:p>
             <w:pPr>
-              <w:pStyle w:val="Ttulodelatablauser"/>
+              <w:pStyle w:val="Ttulodelatabla"/>
               <w:ind w:hanging="0" w:start="0" w:end="0"/>
               <w:rPr/>
             </w:pPr>
@@ -2666,7 +2666,7 @@
           </w:tcPr>
           <w:p>
             <w:pPr>
-              <w:pStyle w:val="Ttulodelatablauser"/>
+              <w:pStyle w:val="Ttulodelatabla"/>
               <w:ind w:hanging="0" w:start="0" w:end="0"/>
               <w:rPr/>
             </w:pPr>
@@ -2684,7 +2684,7 @@
           </w:tcPr>
           <w:p>
             <w:pPr>
-              <w:pStyle w:val="Ttulodelatablauser"/>
+              <w:pStyle w:val="Ttulodelatabla"/>
               <w:ind w:hanging="0" w:start="0" w:end="0"/>
               <w:rPr/>
             </w:pPr>
@@ -2705,13 +2705,13 @@
           </w:tcPr>
           <w:p>
             <w:pPr>
-              <w:pStyle w:val="Contenidodelatablauser"/>
+              <w:pStyle w:val="Contenidodelatabla"/>
               <w:ind w:hanging="0" w:start="0" w:end="0"/>
               <w:rPr/>
             </w:pPr>
             <w:r>
               <w:rPr>
-                <w:rStyle w:val="Textooriginaluser"/>
+                <w:rStyle w:val="Textooriginal"/>
               </w:rPr>
               <w:t>dental_nofreeze_suave</w:t>
             </w:r>
@@ -2725,7 +2725,7 @@
           </w:tcPr>
           <w:p>
             <w:pPr>
-              <w:pStyle w:val="Contenidodelatablauser"/>
+              <w:pStyle w:val="Contenidodelatabla"/>
               <w:ind w:hanging="0" w:start="0" w:end="0"/>
               <w:rPr/>
             </w:pPr>
@@ -2749,7 +2749,7 @@
           </w:tcPr>
           <w:p>
             <w:pPr>
-              <w:pStyle w:val="Contenidodelatablauser"/>
+              <w:pStyle w:val="Contenidodelatabla"/>
               <w:ind w:hanging="0" w:start="0" w:end="0"/>
               <w:rPr/>
             </w:pPr>
@@ -2773,7 +2773,7 @@
           </w:tcPr>
           <w:p>
             <w:pPr>
-              <w:pStyle w:val="Contenidodelatablauser"/>
+              <w:pStyle w:val="Contenidodelatabla"/>
               <w:ind w:hanging="0" w:start="0" w:end="0"/>
               <w:rPr/>
             </w:pPr>
@@ -2794,13 +2794,13 @@
           </w:tcPr>
           <w:p>
             <w:pPr>
-              <w:pStyle w:val="Contenidodelatablauser"/>
+              <w:pStyle w:val="Contenidodelatabla"/>
               <w:ind w:hanging="0" w:start="0" w:end="0"/>
               <w:rPr/>
             </w:pPr>
             <w:r>
               <w:rPr>
-                <w:rStyle w:val="Textooriginaluser"/>
+                <w:rStyle w:val="Textooriginal"/>
               </w:rPr>
               <w:t>dental_alta_resolucion</w:t>
             </w:r>
@@ -2814,7 +2814,7 @@
           </w:tcPr>
           <w:p>
             <w:pPr>
-              <w:pStyle w:val="Contenidodelatablauser"/>
+              <w:pStyle w:val="Contenidodelatabla"/>
               <w:ind w:hanging="0" w:start="0" w:end="0"/>
               <w:rPr/>
             </w:pPr>
@@ -2832,7 +2832,7 @@
           </w:tcPr>
           <w:p>
             <w:pPr>
-              <w:pStyle w:val="Contenidodelatablauser"/>
+              <w:pStyle w:val="Contenidodelatabla"/>
               <w:ind w:hanging="0" w:start="0" w:end="0"/>
               <w:rPr/>
             </w:pPr>
@@ -2850,7 +2850,7 @@
           </w:tcPr>
           <w:p>
             <w:pPr>
-              <w:pStyle w:val="Contenidodelatablauser"/>
+              <w:pStyle w:val="Contenidodelatabla"/>
               <w:ind w:hanging="0" w:start="0" w:end="0"/>
               <w:rPr/>
             </w:pPr>
@@ -2871,13 +2871,13 @@
           </w:tcPr>
           <w:p>
             <w:pPr>
-              <w:pStyle w:val="Contenidodelatablauser"/>
+              <w:pStyle w:val="Contenidodelatabla"/>
               <w:ind w:hanging="0" w:start="0" w:end="0"/>
               <w:rPr/>
             </w:pPr>
             <w:r>
               <w:rPr>
-                <w:rStyle w:val="Textooriginaluser"/>
+                <w:rStyle w:val="Textooriginal"/>
               </w:rPr>
               <w:t>dental_definitivo</w:t>
             </w:r>
@@ -2891,7 +2891,7 @@
           </w:tcPr>
           <w:p>
             <w:pPr>
-              <w:pStyle w:val="Contenidodelatablauser"/>
+              <w:pStyle w:val="Contenidodelatabla"/>
               <w:ind w:hanging="0" w:start="0" w:end="0"/>
               <w:rPr/>
             </w:pPr>
@@ -2909,7 +2909,7 @@
           </w:tcPr>
           <w:p>
             <w:pPr>
-              <w:pStyle w:val="Contenidodelatablauser"/>
+              <w:pStyle w:val="Contenidodelatabla"/>
               <w:ind w:hanging="0" w:start="0" w:end="0"/>
               <w:rPr/>
             </w:pPr>
@@ -2927,7 +2927,7 @@
           </w:tcPr>
           <w:p>
             <w:pPr>
-              <w:pStyle w:val="Contenidodelatablauser"/>
+              <w:pStyle w:val="Contenidodelatabla"/>
               <w:rPr/>
             </w:pPr>
             <w:r>
@@ -2970,7 +2970,7 @@
       </w:r>
       <w:r>
         <w:rPr>
-          <w:rStyle w:val="Textooriginaluser"/>
+          <w:rStyle w:val="Textooriginal"/>
         </w:rPr>
         <w:t>dental_nofreeze_suave</w:t>
       </w:r>
@@ -3023,7 +3023,7 @@
       </w:r>
       <w:r>
         <w:rPr>
-          <w:rStyle w:val="Textooriginaluser"/>
+          <w:rStyle w:val="Textooriginal"/>
         </w:rPr>
         <w:t>dental_alta_resolucion</w:t>
       </w:r>
@@ -3033,7 +3033,7 @@
       </w:r>
       <w:r>
         <w:rPr>
-          <w:rStyle w:val="Textooriginaluser"/>
+          <w:rStyle w:val="Textooriginal"/>
         </w:rPr>
         <w:t>dental_definitivo</w:t>
       </w:r>
@@ -3103,7 +3103,7 @@
       </w:r>
       <w:r>
         <w:rPr>
-          <w:rStyle w:val="Textooriginaluser"/>
+          <w:rStyle w:val="Textooriginal"/>
         </w:rPr>
         <w:t>best.pt</w:t>
       </w:r>
@@ -3113,7 +3113,7 @@
       </w:r>
       <w:r>
         <w:rPr>
-          <w:rStyle w:val="Textooriginaluser"/>
+          <w:rStyle w:val="Textooriginal"/>
         </w:rPr>
         <w:t>dental_nofreeze_suave</w:t>
       </w:r>
@@ -3212,7 +3212,7 @@
       </w:r>
       <w:r>
         <w:rPr>
-          <w:rStyle w:val="Textooriginaluser"/>
+          <w:rStyle w:val="Textooriginal"/>
         </w:rPr>
         <w:t>yolo26n.pt</w:t>
       </w:r>
@@ -3222,7 +3222,7 @@
       </w:r>
       <w:r>
         <w:rPr>
-          <w:rStyle w:val="Textooriginaluser"/>
+          <w:rStyle w:val="Textooriginal"/>
         </w:rPr>
         <w:t>yolov8n.pt</w:t>
       </w:r>
@@ -3264,7 +3264,7 @@
       </w:r>
       <w:r>
         <w:rPr>
-          <w:rStyle w:val="Textooriginaluser"/>
+          <w:rStyle w:val="Textooriginal"/>
         </w:rPr>
         <w:t>yolov8s.pt</w:t>
       </w:r>
@@ -3286,7 +3286,7 @@
       </w:r>
       <w:r>
         <w:rPr>
-          <w:rStyle w:val="Textooriginaluser"/>
+          <w:rStyle w:val="Textooriginal"/>
         </w:rPr>
         <w:t>yolov8m.pt</w:t>
       </w:r>
@@ -3353,7 +3353,7 @@
       </w:r>
       <w:r>
         <w:rPr>
-          <w:rStyle w:val="Textooriginaluser"/>
+          <w:rStyle w:val="Textooriginal"/>
         </w:rPr>
         <w:t>python .\tools\train_yolov8.py --model yolov8s.pt ...</w:t>
       </w:r>
@@ -3442,7 +3442,7 @@
       </w:r>
       <w:r>
         <w:rPr>
-          <w:rStyle w:val="Textooriginaluser"/>
+          <w:rStyle w:val="Textooriginal"/>
         </w:rPr>
         <w:t>train_yolov8.py</w:t>
       </w:r>
@@ -3452,7 +3452,7 @@
       </w:r>
       <w:r>
         <w:rPr>
-          <w:rStyle w:val="Textooriginaluser"/>
+          <w:rStyle w:val="Textooriginal"/>
         </w:rPr>
         <w:t>model.train()</w:t>
       </w:r>
@@ -3478,7 +3478,7 @@
       </w:pPr>
       <w:r>
         <w:rPr>
-          <w:rStyle w:val="Textooriginaluser"/>
+          <w:rStyle w:val="Textooriginal"/>
         </w:rPr>
         <w:t>mixup=0.15</w:t>
       </w:r>
@@ -3504,7 +3504,7 @@
       </w:pPr>
       <w:r>
         <w:rPr>
-          <w:rStyle w:val="Textooriginaluser"/>
+          <w:rStyle w:val="Textooriginal"/>
         </w:rPr>
         <w:t>copy_paste=0.1</w:t>
       </w:r>
@@ -3525,7 +3525,7 @@
       </w:pPr>
       <w:r>
         <w:rPr>
-          <w:rStyle w:val="Textooriginaluser"/>
+          <w:rStyle w:val="Textooriginal"/>
         </w:rPr>
         <w:t>degrees=10.0</w:t>
       </w:r>
@@ -3566,7 +3566,7 @@
       </w:r>
       <w:r>
         <w:rPr>
-          <w:rStyle w:val="Textooriginaluser"/>
+          <w:rStyle w:val="Textooriginal"/>
         </w:rPr>
         <w:t>dental_alta_resolucion</w:t>
       </w:r>
@@ -3576,7 +3576,7 @@
       </w:r>
       <w:r>
         <w:rPr>
-          <w:rStyle w:val="Textooriginaluser"/>
+          <w:rStyle w:val="Textooriginal"/>
         </w:rPr>
         <w:t>imgsz=1024</w:t>
       </w:r>
@@ -3647,7 +3647,7 @@
       </w:r>
       <w:r>
         <w:rPr>
-          <w:rStyle w:val="Textooriginaluser"/>
+          <w:rStyle w:val="Textooriginal"/>
         </w:rPr>
         <w:t>imgsz=800</w:t>
       </w:r>
@@ -3714,7 +3714,7 @@
       </w:r>
       <w:r>
         <w:rPr>
-          <w:rStyle w:val="Textooriginaluser"/>
+          <w:rStyle w:val="Textooriginal"/>
         </w:rPr>
         <w:t>fl_gamma=2.0</w:t>
       </w:r>
@@ -3780,7 +3780,7 @@
       </w:r>
       <w:r>
         <w:rPr>
-          <w:rStyle w:val="Textooriginaluser"/>
+          <w:rStyle w:val="Textooriginal"/>
         </w:rPr>
         <w:t>dental_nofreeze_suave</w:t>
       </w:r>
@@ -3816,7 +3816,7 @@
       </w:r>
       <w:r>
         <w:rPr>
-          <w:rStyle w:val="Textooriginaluser"/>
+          <w:rStyle w:val="Textooriginal"/>
         </w:rPr>
         <w:t>model.predict(source, augment=True)</w:t>
       </w:r>
@@ -3868,7 +3868,7 @@
       </w:r>
       <w:r>
         <w:rPr>
-          <w:rStyle w:val="Textooriginaluser"/>
+          <w:rStyle w:val="Textooriginal"/>
         </w:rPr>
         <w:t>train_yolov8.py</w:t>
       </w:r>
@@ -3971,7 +3971,7 @@
       </w:r>
       <w:r>
         <w:rPr>
-          <w:rStyle w:val="Textooriginaluser"/>
+          <w:rStyle w:val="Textooriginal"/>
         </w:rPr>
         <w:t>yolo26m</w:t>
       </w:r>
@@ -4022,7 +4022,7 @@
           </w:tcPr>
           <w:p>
             <w:pPr>
-              <w:pStyle w:val="Ttulodelatablauser"/>
+              <w:pStyle w:val="Ttulodelatabla"/>
               <w:ind w:hanging="0" w:start="0" w:end="0"/>
               <w:rPr/>
             </w:pPr>
@@ -4040,13 +4040,13 @@
           </w:tcPr>
           <w:p>
             <w:pPr>
-              <w:pStyle w:val="Ttulodelatablauser"/>
+              <w:pStyle w:val="Ttulodelatabla"/>
               <w:ind w:hanging="0" w:start="0" w:end="0"/>
               <w:rPr/>
             </w:pPr>
             <w:r>
               <w:rPr>
-                <w:rStyle w:val="Textooriginaluser"/>
+                <w:rStyle w:val="Textooriginal"/>
               </w:rPr>
               <w:t>dental_nofreeze_suave</w:t>
             </w:r>
@@ -4064,13 +4064,13 @@
           </w:tcPr>
           <w:p>
             <w:pPr>
-              <w:pStyle w:val="Ttulodelatablauser"/>
+              <w:pStyle w:val="Ttulodelatabla"/>
               <w:ind w:hanging="0" w:start="0" w:end="0"/>
               <w:rPr/>
             </w:pPr>
             <w:r>
               <w:rPr>
-                <w:rStyle w:val="Textooriginaluser"/>
+                <w:rStyle w:val="Textooriginal"/>
               </w:rPr>
               <w:t>dental_nofreeze_suave_yolo26m</w:t>
             </w:r>
@@ -4088,7 +4088,7 @@
           </w:tcPr>
           <w:p>
             <w:pPr>
-              <w:pStyle w:val="Ttulodelatablauser"/>
+              <w:pStyle w:val="Ttulodelatabla"/>
               <w:ind w:hanging="0" w:start="0" w:end="0"/>
               <w:rPr/>
             </w:pPr>
@@ -4109,7 +4109,7 @@
           </w:tcPr>
           <w:p>
             <w:pPr>
-              <w:pStyle w:val="Contenidodelatablauser"/>
+              <w:pStyle w:val="Contenidodelatabla"/>
               <w:ind w:hanging="0" w:start="0" w:end="0"/>
               <w:rPr/>
             </w:pPr>
@@ -4129,7 +4129,7 @@
           </w:tcPr>
           <w:p>
             <w:pPr>
-              <w:pStyle w:val="Contenidodelatablauser"/>
+              <w:pStyle w:val="Contenidodelatabla"/>
               <w:ind w:hanging="0" w:start="0" w:end="0"/>
               <w:rPr/>
             </w:pPr>
@@ -4147,7 +4147,7 @@
           </w:tcPr>
           <w:p>
             <w:pPr>
-              <w:pStyle w:val="Contenidodelatablauser"/>
+              <w:pStyle w:val="Contenidodelatabla"/>
               <w:ind w:hanging="0" w:start="0" w:end="0"/>
               <w:rPr/>
             </w:pPr>
@@ -4171,7 +4171,7 @@
           </w:tcPr>
           <w:p>
             <w:pPr>
-              <w:pStyle w:val="Contenidodelatablauser"/>
+              <w:pStyle w:val="Contenidodelatabla"/>
               <w:ind w:hanging="0" w:start="0" w:end="0"/>
               <w:rPr/>
             </w:pPr>
@@ -4194,7 +4194,7 @@
           </w:tcPr>
           <w:p>
             <w:pPr>
-              <w:pStyle w:val="Contenidodelatablauser"/>
+              <w:pStyle w:val="Contenidodelatabla"/>
               <w:ind w:hanging="0" w:start="0" w:end="0"/>
               <w:rPr/>
             </w:pPr>
@@ -4214,7 +4214,7 @@
           </w:tcPr>
           <w:p>
             <w:pPr>
-              <w:pStyle w:val="Contenidodelatablauser"/>
+              <w:pStyle w:val="Contenidodelatabla"/>
               <w:ind w:hanging="0" w:start="0" w:end="0"/>
               <w:rPr/>
             </w:pPr>
@@ -4232,7 +4232,7 @@
           </w:tcPr>
           <w:p>
             <w:pPr>
-              <w:pStyle w:val="Contenidodelatablauser"/>
+              <w:pStyle w:val="Contenidodelatabla"/>
               <w:ind w:hanging="0" w:start="0" w:end="0"/>
               <w:rPr/>
             </w:pPr>
@@ -4256,7 +4256,7 @@
           </w:tcPr>
           <w:p>
             <w:pPr>
-              <w:pStyle w:val="Contenidodelatablauser"/>
+              <w:pStyle w:val="Contenidodelatabla"/>
               <w:ind w:hanging="0" w:start="0" w:end="0"/>
               <w:rPr/>
             </w:pPr>
@@ -4304,7 +4304,7 @@
       </w:r>
       <w:r>
         <w:rPr>
-          <w:rStyle w:val="Textooriginaluser"/>
+          <w:rStyle w:val="Textooriginal"/>
         </w:rPr>
         <w:t>dental_nofreeze_suave_yolo26m</w:t>
       </w:r>
@@ -4393,7 +4393,7 @@
       </w:r>
       <w:r>
         <w:rPr>
-          <w:rStyle w:val="Textooriginaluser"/>
+          <w:rStyle w:val="Textooriginal"/>
         </w:rPr>
         <w:t>batch</w:t>
       </w:r>
@@ -4480,7 +4480,7 @@
       </w:r>
       <w:r>
         <w:rPr>
-          <w:rStyle w:val="Textooriginaluser"/>
+          <w:rStyle w:val="Textooriginal"/>
         </w:rPr>
         <w:t>lr0=0.0005</w:t>
       </w:r>
@@ -4490,7 +4490,7 @@
       </w:r>
       <w:r>
         <w:rPr>
-          <w:rStyle w:val="Textooriginaluser"/>
+          <w:rStyle w:val="Textooriginal"/>
         </w:rPr>
         <w:t>cos-lr</w:t>
       </w:r>
@@ -4623,7 +4623,7 @@
       </w:r>
       <w:r>
         <w:rPr>
-          <w:rStyle w:val="Textooriginaluser"/>
+          <w:rStyle w:val="Textooriginal"/>
         </w:rPr>
         <w:t>yolo26l.pt</w:t>
       </w:r>
@@ -4653,7 +4653,7 @@
       </w:r>
       <w:r>
         <w:rPr>
-          <w:rStyle w:val="Textooriginaluser"/>
+          <w:rStyle w:val="Textooriginal"/>
         </w:rPr>
         <w:t>--imgsz 800</w:t>
       </w:r>
@@ -4663,7 +4663,7 @@
       </w:r>
       <w:r>
         <w:rPr>
-          <w:rStyle w:val="Textooriginaluser"/>
+          <w:rStyle w:val="Textooriginal"/>
         </w:rPr>
         <w:t>--imgsz 640</w:t>
       </w:r>
@@ -4693,7 +4693,7 @@
       </w:r>
       <w:r>
         <w:rPr>
-          <w:rStyle w:val="Textooriginaluser"/>
+          <w:rStyle w:val="Textooriginal"/>
         </w:rPr>
         <w:t>--batch 4</w:t>
       </w:r>
@@ -4703,7 +4703,7 @@
       </w:r>
       <w:r>
         <w:rPr>
-          <w:rStyle w:val="Textooriginaluser"/>
+          <w:rStyle w:val="Textooriginal"/>
         </w:rPr>
         <w:t>--batch 2</w:t>
       </w:r>
@@ -4857,7 +4857,7 @@
     </w:p>
     <w:p>
       <w:pPr>
-        <w:pStyle w:val="Lneahorizontaluser"/>
+        <w:pStyle w:val="Lneahorizontal"/>
         <w:spacing w:lineRule="auto" w:line="276" w:before="0" w:after="140"/>
         <w:rPr>
           <w:sz w:val="24"/>
@@ -4911,7 +4911,7 @@
       </w:r>
       <w:r>
         <w:rPr>
-          <w:rStyle w:val="Textooriginaluser"/>
+          <w:rStyle w:val="Textooriginal"/>
         </w:rPr>
         <w:t>Medium</w:t>
       </w:r>
@@ -5088,7 +5088,7 @@
       </w:r>
       <w:r>
         <w:rPr>
-          <w:rStyle w:val="Textooriginal"/>
+          <w:rStyle w:val="Textooriginaluser"/>
         </w:rPr>
         <w:t>tools/train_yolov8.py</w:t>
       </w:r>
@@ -5098,7 +5098,7 @@
       </w:r>
       <w:r>
         <w:rPr>
-          <w:rStyle w:val="Textooriginal"/>
+          <w:rStyle w:val="Textooriginaluser"/>
         </w:rPr>
         <w:t>--tune</w:t>
       </w:r>
@@ -5108,7 +5108,7 @@
       </w:r>
       <w:r>
         <w:rPr>
-          <w:rStyle w:val="Textooriginal"/>
+          <w:rStyle w:val="Textooriginaluser"/>
         </w:rPr>
         <w:t>--iterations</w:t>
       </w:r>
@@ -5194,7 +5194,7 @@
       </w:r>
       <w:r>
         <w:rPr>
-          <w:rStyle w:val="Textooriginal"/>
+          <w:rStyle w:val="Textooriginaluser"/>
         </w:rPr>
         <w:t>yolo26m.pt</w:t>
       </w:r>
@@ -5210,7 +5210,7 @@
       </w:r>
       <w:r>
         <w:rPr>
-          <w:rStyle w:val="Textooriginal"/>
+          <w:rStyle w:val="Textooriginaluser"/>
         </w:rPr>
         <w:t>Medium</w:t>
       </w:r>
@@ -5240,7 +5240,7 @@
       </w:r>
       <w:r>
         <w:rPr>
-          <w:rStyle w:val="Textooriginal"/>
+          <w:rStyle w:val="Textooriginaluser"/>
         </w:rPr>
         <w:t>640</w:t>
       </w:r>
@@ -5310,7 +5310,7 @@
       </w:r>
       <w:r>
         <w:rPr>
-          <w:rStyle w:val="Textooriginal"/>
+          <w:rStyle w:val="Textooriginaluser"/>
         </w:rPr>
         <w:t>best_hyperparameters.yaml</w:t>
       </w:r>
@@ -5337,7 +5337,7 @@
       </w:r>
       <w:r>
         <w:rPr>
-          <w:rStyle w:val="Textooriginal"/>
+          <w:rStyle w:val="Textooriginaluser"/>
         </w:rPr>
         <w:t>yolo26m.pt</w:t>
       </w:r>
@@ -5395,7 +5395,7 @@
     </w:p>
     <w:p>
       <w:pPr>
-        <w:pStyle w:val="Textopreformateado"/>
+        <w:pStyle w:val="Textopreformateadouser"/>
         <w:spacing w:lineRule="auto" w:line="276" w:before="0" w:after="283"/>
         <w:ind w:hanging="0" w:start="0" w:end="0"/>
         <w:rPr>
@@ -5415,7 +5415,7 @@
     </w:p>
     <w:p>
       <w:pPr>
-        <w:pStyle w:val="Textopreformateado"/>
+        <w:pStyle w:val="Textopreformateadouser"/>
         <w:spacing w:lineRule="auto" w:line="276" w:before="0" w:after="283"/>
         <w:ind w:hanging="0" w:start="0" w:end="0"/>
         <w:rPr/>
@@ -5455,7 +5455,7 @@
       </w:pPr>
       <w:r>
         <w:rPr>
-          <w:rStyle w:val="Textooriginal"/>
+          <w:rStyle w:val="Textooriginaluser"/>
         </w:rPr>
         <w:t>--tune</w:t>
       </w:r>
@@ -5481,7 +5481,7 @@
       </w:pPr>
       <w:r>
         <w:rPr>
-          <w:rStyle w:val="Textooriginal"/>
+          <w:rStyle w:val="Textooriginaluser"/>
         </w:rPr>
         <w:t>--iterations 10</w:t>
       </w:r>
@@ -5510,7 +5510,7 @@
       </w:r>
       <w:r>
         <w:rPr>
-          <w:rStyle w:val="Textooriginal"/>
+          <w:rStyle w:val="Textooriginaluser"/>
         </w:rPr>
         <w:t>yolo26m.pt</w:t>
       </w:r>
@@ -5520,7 +5520,7 @@
       </w:r>
       <w:r>
         <w:rPr>
-          <w:rStyle w:val="Textooriginal"/>
+          <w:rStyle w:val="Textooriginaluser"/>
         </w:rPr>
         <w:t>--imgsz 640</w:t>
       </w:r>
@@ -5587,7 +5587,7 @@
       </w:r>
       <w:r>
         <w:rPr>
-          <w:rStyle w:val="Textooriginal"/>
+          <w:rStyle w:val="Textooriginaluser"/>
         </w:rPr>
         <w:t>dental_nofreeze_suave_yolo26m</w:t>
       </w:r>
@@ -5630,7 +5630,7 @@
       </w:r>
       <w:r>
         <w:rPr>
-          <w:rStyle w:val="Textooriginal"/>
+          <w:rStyle w:val="Textooriginaluser"/>
         </w:rPr>
         <w:t>best_hyperparameters.yaml</w:t>
       </w:r>
@@ -5681,7 +5681,7 @@
       </w:r>
       <w:r>
         <w:rPr>
-          <w:rStyle w:val="Textooriginal"/>
+          <w:rStyle w:val="Textooriginaluser"/>
         </w:rPr>
         <w:t>Medium</w:t>
       </w:r>
@@ -5734,7 +5734,7 @@
       </w:r>
       <w:r>
         <w:rPr>
-          <w:rStyle w:val="Textooriginal"/>
+          <w:rStyle w:val="Textooriginaluser"/>
         </w:rPr>
         <w:t>yolo26m.pt</w:t>
       </w:r>
@@ -5765,7 +5765,7 @@
       </w:r>
       <w:r>
         <w:rPr>
-          <w:rStyle w:val="Textooriginal"/>
+          <w:rStyle w:val="Textooriginaluser"/>
         </w:rPr>
         <w:t>dental_nofreeze_suave_yolo26m</w:t>
       </w:r>
@@ -5827,7 +5827,7 @@
       </w:r>
       <w:r>
         <w:rPr>
-          <w:rStyle w:val="Textooriginal"/>
+          <w:rStyle w:val="Textooriginaluser"/>
         </w:rPr>
         <w:t>train_yolov8.py</w:t>
       </w:r>
@@ -5837,7 +5837,7 @@
       </w:r>
       <w:r>
         <w:rPr>
-          <w:rStyle w:val="Textooriginal"/>
+          <w:rStyle w:val="Textooriginaluser"/>
         </w:rPr>
         <w:t>--cfg</w:t>
       </w:r>
@@ -5847,7 +5847,7 @@
       </w:r>
       <w:r>
         <w:rPr>
-          <w:rStyle w:val="Textooriginal"/>
+          <w:rStyle w:val="Textooriginaluser"/>
         </w:rPr>
         <w:t>best_hyperparameters.yaml</w:t>
       </w:r>
@@ -5871,7 +5871,7 @@
     </w:p>
     <w:p>
       <w:pPr>
-        <w:pStyle w:val="Textopreformateado"/>
+        <w:pStyle w:val="Textopreformateadouser"/>
         <w:spacing w:lineRule="auto" w:line="276"/>
         <w:ind w:hanging="0" w:start="0" w:end="0"/>
         <w:rPr>
@@ -5891,7 +5891,7 @@
     </w:p>
     <w:p>
       <w:pPr>
-        <w:pStyle w:val="Textopreformateado"/>
+        <w:pStyle w:val="Textopreformateadouser"/>
         <w:spacing w:lineRule="auto" w:line="276" w:before="0" w:after="283"/>
         <w:ind w:hanging="0" w:start="0" w:end="0"/>
         <w:rPr>
@@ -5923,7 +5923,7 @@
       </w:r>
       <w:r>
         <w:rPr>
-          <w:rStyle w:val="Textooriginal"/>
+          <w:rStyle w:val="Textooriginaluser"/>
         </w:rPr>
         <w:t>--imgsz 1024</w:t>
       </w:r>
@@ -5935,7 +5935,7 @@
       </w:r>
       <w:r>
         <w:rPr>
-          <w:rStyle w:val="Textooriginal"/>
+          <w:rStyle w:val="Textooriginaluser"/>
         </w:rPr>
         <w:t>--batch 8</w:t>
       </w:r>
@@ -5985,11 +5985,88 @@
     </w:p>
     <w:p>
       <w:pPr>
+        <w:pStyle w:val="BodyText"/>
+        <w:widowControl/>
+        <w:suppressAutoHyphens w:val="true"/>
+        <w:bidi w:val="0"/>
+        <w:spacing w:before="0" w:after="283"/>
+        <w:jc w:val="start"/>
+        <w:rPr>
+          <w:rFonts w:ascii="Liberation Serif" w:hAnsi="Liberation Serif" w:eastAsia="NSimSun" w:cs="Arial"/>
+          <w:color w:val="auto"/>
+          <w:kern w:val="2"/>
+          <w:sz w:val="24"/>
+          <w:szCs w:val="24"/>
+          <w:lang w:val="es-ES" w:eastAsia="zh-CN" w:bidi="hi-IN"/>
+        </w:rPr>
+      </w:pPr>
+      <w:r>
+        <w:rPr>
+          <w:rFonts w:eastAsia="NSimSun" w:cs="Arial"/>
+          <w:color w:val="auto"/>
+          <w:kern w:val="2"/>
+          <w:sz w:val="24"/>
+          <w:szCs w:val="24"/>
+          <w:lang w:val="es-ES" w:eastAsia="zh-CN" w:bidi="hi-IN"/>
+        </w:rPr>
+        <w:t>python</w:t>
+      </w:r>
+      <w:r>
+        <w:rPr>
+          <w:rFonts w:eastAsia="NSimSun" w:cs="Arial"/>
+          <w:color w:val="auto"/>
+          <w:kern w:val="2"/>
+          <w:sz w:val="24"/>
+          <w:szCs w:val="24"/>
+          <w:lang w:val="es-ES" w:eastAsia="zh-CN" w:bidi="hi-IN"/>
+        </w:rPr>
+        <w:t>3</w:t>
+      </w:r>
+      <w:r>
+        <w:rPr>
+          <w:rFonts w:eastAsia="NSimSun" w:cs="Arial"/>
+          <w:color w:val="auto"/>
+          <w:kern w:val="2"/>
+          <w:sz w:val="24"/>
+          <w:szCs w:val="24"/>
+          <w:lang w:val="es-ES" w:eastAsia="zh-CN" w:bidi="hi-IN"/>
+        </w:rPr>
+        <w:t xml:space="preserve"> .\tools\train_yolov8.py --data .\dataset\data.yaml --model yolo26m.pt --device 0 --epochs 150 --imgsz 1024 --batch 7 --workers 8 --name "dental_definitivo_optimizado_medium" --cfg ".\runs\train\dental_tuning_medium_hiperparámetros\best_hyperparameters.yaml"</w:t>
+      </w:r>
+    </w:p>
+    <w:p>
+      <w:pPr>
+        <w:pStyle w:val="Heading1"/>
+        <w:numPr>
+          <w:ilvl w:val="0"/>
+          <w:numId w:val="0"/>
+        </w:numPr>
+        <w:ind w:hanging="0" w:start="0"/>
+        <w:rPr/>
+      </w:pPr>
+      <w:r>
+        <w:rPr/>
+        <w:t>De notebooklm</w:t>
+      </w:r>
+    </w:p>
+    <w:p>
+      <w:pPr>
         <w:pStyle w:val="Heading1"/>
         <w:numPr>
           <w:ilvl w:val="0"/>
           <w:numId w:val="2"/>
         </w:numPr>
+        <w:ind w:hanging="0" w:start="0"/>
+        <w:rPr/>
+      </w:pPr>
+      <w:r>
+        <w:rPr/>
+        <w:t xml:space="preserve">Hazme un resumen </w:t>
+      </w:r>
+    </w:p>
+    <w:p>
+      <w:pPr>
+        <w:pStyle w:val="BodyText"/>
         <w:spacing w:lineRule="auto" w:line="276" w:before="0" w:after="283"/>
         <w:ind w:hanging="0" w:start="0" w:end="0"/>
         <w:rPr>
@@ -6001,43 +6078,2401 @@
       </w:pPr>
       <w:r>
         <w:rPr>
-          <w:rFonts w:cs="Arial" w:ascii="Liberation Serif" w:hAnsi="Liberation Serif"/>
+          <w:rFonts w:cs="Arial"/>
           <w:sz w:val="24"/>
           <w:szCs w:val="24"/>
-        </w:rPr>
-        <w:t xml:space="preserve">python .\tools\train_yolov8.py --data .\dataset\data.yaml --model yolo26m.pt --device 0 --epochs 150 --imgsz 1024 --batch </w:t>
-      </w:r>
-      <w:r>
-        <w:rPr>
-          <w:rFonts w:cs="Arial" w:ascii="Liberation Serif" w:hAnsi="Liberation Serif"/>
-          <w:sz w:val="24"/>
-          <w:szCs w:val="24"/>
-        </w:rPr>
-        <w:t>7</w:t>
-      </w:r>
-      <w:r>
-        <w:rPr>
-          <w:rFonts w:cs="Arial" w:ascii="Liberation Serif" w:hAnsi="Liberation Serif"/>
-          <w:sz w:val="24"/>
-          <w:szCs w:val="24"/>
-        </w:rPr>
-        <w:t xml:space="preserve"> --workers </w:t>
-      </w:r>
-      <w:r>
-        <w:rPr>
-          <w:rFonts w:cs="Arial" w:ascii="Liberation Serif" w:hAnsi="Liberation Serif"/>
-          <w:sz w:val="24"/>
-          <w:szCs w:val="24"/>
-        </w:rPr>
-        <w:t>8</w:t>
-      </w:r>
-      <w:r>
-        <w:rPr>
-          <w:rFonts w:cs="Arial" w:ascii="Liberation Serif" w:hAnsi="Liberation Serif"/>
-          <w:sz w:val="24"/>
-          <w:szCs w:val="24"/>
-        </w:rPr>
-        <w:t xml:space="preserve"> --name "dental_definitivo_optimizado_medium" --cfg ".\runs\train\dental_tuning_medium_hiperparámetros\best_hyperparameters.yaml"</w:t>
+          <w:u w:val="none"/>
+        </w:rPr>
+        <w:t>Al analizar los resultados de todos los experimentos extraídos de los archivos CSV, se pueden identificar cuatro factores clave que han determinado el éxito en el rendimiento de los modelos para la detección de problemas dentales:</w:t>
+      </w:r>
+    </w:p>
+    <w:p>
+      <w:pPr>
+        <w:pStyle w:val="BodyText"/>
+        <w:spacing w:before="0" w:after="283"/>
+        <w:rPr/>
+      </w:pPr>
+      <w:r>
+        <w:rPr>
+          <w:rStyle w:val="Strong"/>
+        </w:rPr>
+        <w:t>1. La Escala y Arquitectura del Modelo</w:t>
+      </w:r>
+      <w:r>
+        <w:rPr/>
+        <w:t xml:space="preserve"> El factor que marcó la mayor diferencia fue el tamaño de la red neuronal.</w:t>
+      </w:r>
+    </w:p>
+    <w:p>
+      <w:pPr>
+        <w:pStyle w:val="BodyText"/>
+        <w:numPr>
+          <w:ilvl w:val="0"/>
+          <w:numId w:val="26"/>
+        </w:numPr>
+        <w:tabs>
+          <w:tab w:val="clear" w:pos="709"/>
+          <w:tab w:val="left" w:pos="0" w:leader="none"/>
+        </w:tabs>
+        <w:spacing w:before="0" w:after="0"/>
+        <w:ind w:hanging="283" w:start="709"/>
+        <w:rPr/>
+      </w:pPr>
+      <w:r>
+        <w:rPr/>
+        <w:t xml:space="preserve">Los </w:t>
+      </w:r>
+      <w:r>
+        <w:rPr>
+          <w:rStyle w:val="Strong"/>
+        </w:rPr>
+        <w:t>modelos "Medium" (</w:t>
+      </w:r>
+      <w:r>
+        <w:rPr>
+          <w:rStyle w:val="Textooriginal"/>
+        </w:rPr>
+        <w:t>yolo26m.pt</w:t>
+      </w:r>
+      <w:r>
+        <w:rPr>
+          <w:rStyle w:val="Strong"/>
+        </w:rPr>
+        <w:t>)</w:t>
+      </w:r>
+      <w:r>
+        <w:rPr/>
+        <w:t xml:space="preserve"> superaron ampliamente a los demás, demostrando que su capacidad matemática adicional es crucial para representar los pequeños detalles de las radiografías dentales. Estos modelos lideran los resultados superando la barrera del </w:t>
+      </w:r>
+      <w:r>
+        <w:rPr>
+          <w:rStyle w:val="Strong"/>
+        </w:rPr>
+        <w:t>82% en mAP50</w:t>
+      </w:r>
+      <w:r>
+        <w:rPr/>
+        <w:t xml:space="preserve">. </w:t>
+      </w:r>
+    </w:p>
+    <w:p>
+      <w:pPr>
+        <w:pStyle w:val="BodyText"/>
+        <w:numPr>
+          <w:ilvl w:val="0"/>
+          <w:numId w:val="26"/>
+        </w:numPr>
+        <w:tabs>
+          <w:tab w:val="clear" w:pos="709"/>
+          <w:tab w:val="left" w:pos="0" w:leader="none"/>
+        </w:tabs>
+        <w:ind w:hanging="283" w:start="709"/>
+        <w:rPr/>
+      </w:pPr>
+      <w:r>
+        <w:rPr/>
+        <w:t xml:space="preserve">Los </w:t>
+      </w:r>
+      <w:r>
+        <w:rPr>
+          <w:rStyle w:val="Strong"/>
+        </w:rPr>
+        <w:t>modelos "Nano" (</w:t>
+      </w:r>
+      <w:r>
+        <w:rPr>
+          <w:rStyle w:val="Textooriginal"/>
+        </w:rPr>
+        <w:t>yolo26n.pt</w:t>
+      </w:r>
+      <w:r>
+        <w:rPr>
+          <w:rStyle w:val="Strong"/>
+        </w:rPr>
+        <w:t>)</w:t>
+      </w:r>
+      <w:r>
+        <w:rPr/>
+        <w:t xml:space="preserve">, a pesar de ser mucho más rápidos y ligeros, se quedaron estancados tocando su techo de rendimiento en un </w:t>
+      </w:r>
+      <w:r>
+        <w:rPr>
+          <w:rStyle w:val="Strong"/>
+        </w:rPr>
+        <w:t>75.5% (mAP50)</w:t>
+      </w:r>
+      <w:r>
+        <w:rPr/>
+        <w:t xml:space="preserve">, evidenciando una desventaja de casi el 8% frente a la arquitectura Medium. </w:t>
+      </w:r>
+    </w:p>
+    <w:p>
+      <w:pPr>
+        <w:pStyle w:val="BodyText"/>
+        <w:spacing w:before="0" w:after="283"/>
+        <w:rPr/>
+      </w:pPr>
+      <w:r>
+        <w:rPr>
+          <w:rStyle w:val="Strong"/>
+        </w:rPr>
+        <w:t>2. El Impacto de la Resolución de la Imagen</w:t>
+      </w:r>
+      <w:r>
+        <w:rPr/>
+        <w:t xml:space="preserve"> El aumento de la resolución ha sido fundamental para detectar patologías sutiles o que ocupan muy pocos píxeles en la imagen global.</w:t>
+      </w:r>
+    </w:p>
+    <w:p>
+      <w:pPr>
+        <w:pStyle w:val="BodyText"/>
+        <w:numPr>
+          <w:ilvl w:val="0"/>
+          <w:numId w:val="27"/>
+        </w:numPr>
+        <w:tabs>
+          <w:tab w:val="clear" w:pos="709"/>
+          <w:tab w:val="left" w:pos="0" w:leader="none"/>
+        </w:tabs>
+        <w:spacing w:before="0" w:after="0"/>
+        <w:ind w:hanging="283" w:start="709"/>
+        <w:rPr/>
+      </w:pPr>
+      <w:r>
+        <w:rPr/>
+        <w:t xml:space="preserve">Trabajar a </w:t>
+      </w:r>
+      <w:r>
+        <w:rPr>
+          <w:rStyle w:val="Strong"/>
+        </w:rPr>
+        <w:t>1024px</w:t>
+      </w:r>
+      <w:r>
+        <w:rPr/>
+        <w:t xml:space="preserve"> produjo los mejores resultados absolutos cuando se combinó con el modelo Medium. </w:t>
+      </w:r>
+    </w:p>
+    <w:p>
+      <w:pPr>
+        <w:pStyle w:val="BodyText"/>
+        <w:numPr>
+          <w:ilvl w:val="0"/>
+          <w:numId w:val="27"/>
+        </w:numPr>
+        <w:tabs>
+          <w:tab w:val="clear" w:pos="709"/>
+          <w:tab w:val="left" w:pos="0" w:leader="none"/>
+        </w:tabs>
+        <w:ind w:hanging="283" w:start="709"/>
+        <w:rPr/>
+      </w:pPr>
+      <w:r>
+        <w:rPr/>
+        <w:t xml:space="preserve">Trabajar a </w:t>
+      </w:r>
+      <w:r>
+        <w:rPr>
+          <w:rStyle w:val="Strong"/>
+        </w:rPr>
+        <w:t>800px</w:t>
+      </w:r>
+      <w:r>
+        <w:rPr/>
+        <w:t xml:space="preserve"> otorgó un rendimiento superior y constante para los modelos Nano en comparación con el estándar base de </w:t>
+      </w:r>
+      <w:r>
+        <w:rPr>
+          <w:rStyle w:val="Strong"/>
+        </w:rPr>
+        <w:t>640px</w:t>
+      </w:r>
+      <w:r>
+        <w:rPr/>
+        <w:t xml:space="preserve">. </w:t>
+      </w:r>
+    </w:p>
+    <w:p>
+      <w:pPr>
+        <w:pStyle w:val="BodyText"/>
+        <w:spacing w:before="0" w:after="283"/>
+        <w:rPr/>
+      </w:pPr>
+      <w:r>
+        <w:rPr>
+          <w:rStyle w:val="Strong"/>
+        </w:rPr>
+        <w:t>3. Congelación de Capas (Freeze)</w:t>
+      </w:r>
+      <w:r>
+        <w:rPr/>
+        <w:t xml:space="preserve"> Permitir que la red aprenda desde cero sin capas congeladas (</w:t>
+      </w:r>
+      <w:r>
+        <w:rPr>
+          <w:rStyle w:val="Textooriginal"/>
+        </w:rPr>
+        <w:t>freeze: None</w:t>
+      </w:r>
+      <w:r>
+        <w:rPr/>
+        <w:t>) resultó ser la mejor estrategia. Debido a que las radiografías dentales tienen texturas y características visuales muy distintas a las de los conjuntos de datos genéricos, permitir el ajuste fino (fine-tuning) completo en todas las capas facilitó una mejor adaptación de la IA a las encías y los dientes.</w:t>
+      </w:r>
+    </w:p>
+    <w:p>
+      <w:pPr>
+        <w:pStyle w:val="BodyText"/>
+        <w:spacing w:before="0" w:after="283"/>
+        <w:rPr/>
+      </w:pPr>
+      <w:r>
+        <w:rPr>
+          <w:rStyle w:val="Strong"/>
+        </w:rPr>
+        <w:t>4. El "Tuning" de Hiperparámetros</w:t>
+      </w:r>
+      <w:r>
+        <w:rPr/>
+        <w:t xml:space="preserve"> El descubrimiento de una "receta" matemática ideal mediante algoritmos de búsqueda dio el impulso final. Se descubrió que usar una tasa de aprendizaje inicial (</w:t>
+      </w:r>
+      <w:r>
+        <w:rPr>
+          <w:rStyle w:val="Textooriginal"/>
+        </w:rPr>
+        <w:t>lr0</w:t>
+      </w:r>
+      <w:r>
+        <w:rPr/>
+        <w:t xml:space="preserve">) de </w:t>
+      </w:r>
+      <w:r>
+        <w:rPr>
+          <w:rStyle w:val="Strong"/>
+        </w:rPr>
+        <w:t>0.00403</w:t>
+      </w:r>
+      <w:r>
+        <w:rPr/>
+        <w:t xml:space="preserve"> reducía las oscilaciones y permitía un aprendizaje más robusto. Aplicar estos parámetros al modelo Medium dio lugar al campeón indiscutible: </w:t>
+      </w:r>
+      <w:r>
+        <w:rPr>
+          <w:rStyle w:val="Textooriginal"/>
+        </w:rPr>
+        <w:t>dental_definitivo_optimizado_medium</w:t>
+      </w:r>
+      <w:r>
+        <w:rPr/>
+        <w:t xml:space="preserve">, el cual alcanzó el récord del </w:t>
+      </w:r>
+      <w:r>
+        <w:rPr>
+          <w:rStyle w:val="Strong"/>
+        </w:rPr>
+        <w:t>83.08% en mAP50</w:t>
+      </w:r>
+      <w:r>
+        <w:rPr/>
+        <w:t>.</w:t>
+      </w:r>
+    </w:p>
+    <w:p>
+      <w:pPr>
+        <w:pStyle w:val="BodyText"/>
+        <w:spacing w:before="0" w:after="283"/>
+        <w:rPr/>
+      </w:pPr>
+      <w:r>
+        <w:rPr/>
+        <w:t>A continuación, te presento la tabla comparativa con todos los resultados ordenados del mejor al peor rendimiento global:</w:t>
+      </w:r>
+    </w:p>
+    <w:tbl>
+      <w:tblPr>
+        <w:tblW w:w="10307" w:type="dxa"/>
+        <w:jc w:val="start"/>
+        <w:tblInd w:w="0" w:type="dxa"/>
+        <w:tblLayout w:type="fixed"/>
+        <w:tblCellMar>
+          <w:top w:w="28" w:type="dxa"/>
+          <w:start w:w="28" w:type="dxa"/>
+          <w:bottom w:w="28" w:type="dxa"/>
+          <w:end w:w="28" w:type="dxa"/>
+        </w:tblCellMar>
+      </w:tblPr>
+      <w:tblGrid>
+        <w:gridCol w:w="4081"/>
+        <w:gridCol w:w="1206"/>
+        <w:gridCol w:w="1226"/>
+        <w:gridCol w:w="892"/>
+        <w:gridCol w:w="865"/>
+        <w:gridCol w:w="944"/>
+        <w:gridCol w:w="1093"/>
+      </w:tblGrid>
+      <w:tr>
+        <w:trPr/>
+        <w:tc>
+          <w:tcPr>
+            <w:tcW w:w="4081" w:type="dxa"/>
+            <w:tcBorders/>
+            <w:vAlign w:val="center"/>
+          </w:tcPr>
+          <w:p>
+            <w:pPr>
+              <w:pStyle w:val="Ttulodelatabla"/>
+              <w:jc w:val="start"/>
+              <w:rPr/>
+            </w:pPr>
+            <w:r>
+              <w:rPr/>
+              <w:t>Experimento</w:t>
+            </w:r>
+          </w:p>
+        </w:tc>
+        <w:tc>
+          <w:tcPr>
+            <w:tcW w:w="1206" w:type="dxa"/>
+            <w:tcBorders/>
+            <w:vAlign w:val="center"/>
+          </w:tcPr>
+          <w:p>
+            <w:pPr>
+              <w:pStyle w:val="Ttulodelatabla"/>
+              <w:jc w:val="start"/>
+              <w:rPr/>
+            </w:pPr>
+            <w:r>
+              <w:rPr/>
+              <w:t>Modelo</w:t>
+            </w:r>
+          </w:p>
+        </w:tc>
+        <w:tc>
+          <w:tcPr>
+            <w:tcW w:w="1226" w:type="dxa"/>
+            <w:tcBorders/>
+            <w:vAlign w:val="center"/>
+          </w:tcPr>
+          <w:p>
+            <w:pPr>
+              <w:pStyle w:val="Ttulodelatabla"/>
+              <w:jc w:val="start"/>
+              <w:rPr/>
+            </w:pPr>
+            <w:r>
+              <w:rPr/>
+              <w:t>Resolución (px)</w:t>
+            </w:r>
+          </w:p>
+        </w:tc>
+        <w:tc>
+          <w:tcPr>
+            <w:tcW w:w="892" w:type="dxa"/>
+            <w:tcBorders/>
+            <w:vAlign w:val="center"/>
+          </w:tcPr>
+          <w:p>
+            <w:pPr>
+              <w:pStyle w:val="Ttulodelatabla"/>
+              <w:jc w:val="start"/>
+              <w:rPr/>
+            </w:pPr>
+            <w:r>
+              <w:rPr/>
+              <w:t>Época Óptima</w:t>
+            </w:r>
+          </w:p>
+        </w:tc>
+        <w:tc>
+          <w:tcPr>
+            <w:tcW w:w="865" w:type="dxa"/>
+            <w:tcBorders/>
+            <w:vAlign w:val="center"/>
+          </w:tcPr>
+          <w:p>
+            <w:pPr>
+              <w:pStyle w:val="Ttulodelatabla"/>
+              <w:jc w:val="start"/>
+              <w:rPr/>
+            </w:pPr>
+            <w:r>
+              <w:rPr/>
+              <w:t>mAP50 (Mejor)</w:t>
+            </w:r>
+          </w:p>
+        </w:tc>
+        <w:tc>
+          <w:tcPr>
+            <w:tcW w:w="944" w:type="dxa"/>
+            <w:tcBorders/>
+            <w:vAlign w:val="center"/>
+          </w:tcPr>
+          <w:p>
+            <w:pPr>
+              <w:pStyle w:val="Ttulodelatabla"/>
+              <w:jc w:val="start"/>
+              <w:rPr/>
+            </w:pPr>
+            <w:r>
+              <w:rPr/>
+              <w:t>mAP50-95 (Mejor)</w:t>
+            </w:r>
+          </w:p>
+        </w:tc>
+        <w:tc>
+          <w:tcPr>
+            <w:tcW w:w="1093" w:type="dxa"/>
+            <w:tcBorders/>
+            <w:vAlign w:val="center"/>
+          </w:tcPr>
+          <w:p>
+            <w:pPr>
+              <w:pStyle w:val="Ttulodelatabla"/>
+              <w:jc w:val="start"/>
+              <w:rPr/>
+            </w:pPr>
+            <w:r>
+              <w:rPr/>
+              <w:t>Precisión</w:t>
+            </w:r>
+          </w:p>
+        </w:tc>
+      </w:tr>
+      <w:tr>
+        <w:trPr/>
+        <w:tc>
+          <w:tcPr>
+            <w:tcW w:w="4081" w:type="dxa"/>
+            <w:tcBorders/>
+            <w:vAlign w:val="center"/>
+          </w:tcPr>
+          <w:p>
+            <w:pPr>
+              <w:pStyle w:val="Contenidodelatabla"/>
+              <w:jc w:val="start"/>
+              <w:rPr/>
+            </w:pPr>
+            <w:r>
+              <w:rPr>
+                <w:rStyle w:val="Strong"/>
+              </w:rPr>
+              <w:t>dental_definitivo_optimizado_medium</w:t>
+            </w:r>
+          </w:p>
+        </w:tc>
+        <w:tc>
+          <w:tcPr>
+            <w:tcW w:w="1206" w:type="dxa"/>
+            <w:tcBorders/>
+            <w:vAlign w:val="center"/>
+          </w:tcPr>
+          <w:p>
+            <w:pPr>
+              <w:pStyle w:val="Contenidodelatabla"/>
+              <w:jc w:val="start"/>
+              <w:rPr/>
+            </w:pPr>
+            <w:r>
+              <w:rPr/>
+              <w:t>yolo26m.pt</w:t>
+            </w:r>
+          </w:p>
+        </w:tc>
+        <w:tc>
+          <w:tcPr>
+            <w:tcW w:w="1226" w:type="dxa"/>
+            <w:tcBorders/>
+            <w:vAlign w:val="center"/>
+          </w:tcPr>
+          <w:p>
+            <w:pPr>
+              <w:pStyle w:val="Contenidodelatabla"/>
+              <w:jc w:val="start"/>
+              <w:rPr/>
+            </w:pPr>
+            <w:r>
+              <w:rPr/>
+              <w:t>1024</w:t>
+            </w:r>
+          </w:p>
+        </w:tc>
+        <w:tc>
+          <w:tcPr>
+            <w:tcW w:w="892" w:type="dxa"/>
+            <w:tcBorders/>
+            <w:vAlign w:val="center"/>
+          </w:tcPr>
+          <w:p>
+            <w:pPr>
+              <w:pStyle w:val="Contenidodelatabla"/>
+              <w:jc w:val="start"/>
+              <w:rPr/>
+            </w:pPr>
+            <w:r>
+              <w:rPr/>
+              <w:t>86</w:t>
+            </w:r>
+          </w:p>
+        </w:tc>
+        <w:tc>
+          <w:tcPr>
+            <w:tcW w:w="865" w:type="dxa"/>
+            <w:tcBorders/>
+            <w:vAlign w:val="center"/>
+          </w:tcPr>
+          <w:p>
+            <w:pPr>
+              <w:pStyle w:val="Contenidodelatabla"/>
+              <w:jc w:val="start"/>
+              <w:rPr/>
+            </w:pPr>
+            <w:r>
+              <w:rPr>
+                <w:rStyle w:val="Strong"/>
+              </w:rPr>
+              <w:t>0.8308</w:t>
+            </w:r>
+          </w:p>
+        </w:tc>
+        <w:tc>
+          <w:tcPr>
+            <w:tcW w:w="944" w:type="dxa"/>
+            <w:tcBorders/>
+            <w:vAlign w:val="center"/>
+          </w:tcPr>
+          <w:p>
+            <w:pPr>
+              <w:pStyle w:val="Contenidodelatabla"/>
+              <w:jc w:val="start"/>
+              <w:rPr/>
+            </w:pPr>
+            <w:r>
+              <w:rPr/>
+              <w:t>0.5398</w:t>
+            </w:r>
+          </w:p>
+        </w:tc>
+        <w:tc>
+          <w:tcPr>
+            <w:tcW w:w="1093" w:type="dxa"/>
+            <w:tcBorders/>
+            <w:vAlign w:val="center"/>
+          </w:tcPr>
+          <w:p>
+            <w:pPr>
+              <w:pStyle w:val="Contenidodelatabla"/>
+              <w:jc w:val="start"/>
+              <w:rPr/>
+            </w:pPr>
+            <w:r>
+              <w:rPr/>
+              <w:t>0.7651</w:t>
+            </w:r>
+          </w:p>
+        </w:tc>
+      </w:tr>
+      <w:tr>
+        <w:trPr/>
+        <w:tc>
+          <w:tcPr>
+            <w:tcW w:w="4081" w:type="dxa"/>
+            <w:tcBorders/>
+            <w:vAlign w:val="center"/>
+          </w:tcPr>
+          <w:p>
+            <w:pPr>
+              <w:pStyle w:val="Contenidodelatabla"/>
+              <w:jc w:val="start"/>
+              <w:rPr/>
+            </w:pPr>
+            <w:r>
+              <w:rPr>
+                <w:rStyle w:val="Strong"/>
+              </w:rPr>
+              <w:t>dental_nofreeze_suave_yolo26m</w:t>
+            </w:r>
+          </w:p>
+        </w:tc>
+        <w:tc>
+          <w:tcPr>
+            <w:tcW w:w="1206" w:type="dxa"/>
+            <w:tcBorders/>
+            <w:vAlign w:val="center"/>
+          </w:tcPr>
+          <w:p>
+            <w:pPr>
+              <w:pStyle w:val="Contenidodelatabla"/>
+              <w:jc w:val="start"/>
+              <w:rPr/>
+            </w:pPr>
+            <w:r>
+              <w:rPr/>
+              <w:t>yolo26m.pt</w:t>
+            </w:r>
+          </w:p>
+        </w:tc>
+        <w:tc>
+          <w:tcPr>
+            <w:tcW w:w="1226" w:type="dxa"/>
+            <w:tcBorders/>
+            <w:vAlign w:val="center"/>
+          </w:tcPr>
+          <w:p>
+            <w:pPr>
+              <w:pStyle w:val="Contenidodelatabla"/>
+              <w:jc w:val="start"/>
+              <w:rPr/>
+            </w:pPr>
+            <w:r>
+              <w:rPr/>
+              <w:t>1024</w:t>
+            </w:r>
+          </w:p>
+        </w:tc>
+        <w:tc>
+          <w:tcPr>
+            <w:tcW w:w="892" w:type="dxa"/>
+            <w:tcBorders/>
+            <w:vAlign w:val="center"/>
+          </w:tcPr>
+          <w:p>
+            <w:pPr>
+              <w:pStyle w:val="Contenidodelatabla"/>
+              <w:jc w:val="start"/>
+              <w:rPr/>
+            </w:pPr>
+            <w:r>
+              <w:rPr/>
+              <w:t>39</w:t>
+            </w:r>
+          </w:p>
+        </w:tc>
+        <w:tc>
+          <w:tcPr>
+            <w:tcW w:w="865" w:type="dxa"/>
+            <w:tcBorders/>
+            <w:vAlign w:val="center"/>
+          </w:tcPr>
+          <w:p>
+            <w:pPr>
+              <w:pStyle w:val="Contenidodelatabla"/>
+              <w:jc w:val="start"/>
+              <w:rPr/>
+            </w:pPr>
+            <w:r>
+              <w:rPr>
+                <w:rStyle w:val="Strong"/>
+              </w:rPr>
+              <w:t>0.8219</w:t>
+            </w:r>
+          </w:p>
+        </w:tc>
+        <w:tc>
+          <w:tcPr>
+            <w:tcW w:w="944" w:type="dxa"/>
+            <w:tcBorders/>
+            <w:vAlign w:val="center"/>
+          </w:tcPr>
+          <w:p>
+            <w:pPr>
+              <w:pStyle w:val="Contenidodelatabla"/>
+              <w:jc w:val="start"/>
+              <w:rPr/>
+            </w:pPr>
+            <w:r>
+              <w:rPr/>
+              <w:t>0.5464</w:t>
+            </w:r>
+          </w:p>
+        </w:tc>
+        <w:tc>
+          <w:tcPr>
+            <w:tcW w:w="1093" w:type="dxa"/>
+            <w:tcBorders/>
+            <w:vAlign w:val="center"/>
+          </w:tcPr>
+          <w:p>
+            <w:pPr>
+              <w:pStyle w:val="Contenidodelatabla"/>
+              <w:jc w:val="start"/>
+              <w:rPr/>
+            </w:pPr>
+            <w:r>
+              <w:rPr/>
+              <w:t>0.8534</w:t>
+            </w:r>
+          </w:p>
+        </w:tc>
+      </w:tr>
+      <w:tr>
+        <w:trPr/>
+        <w:tc>
+          <w:tcPr>
+            <w:tcW w:w="4081" w:type="dxa"/>
+            <w:tcBorders/>
+            <w:vAlign w:val="center"/>
+          </w:tcPr>
+          <w:p>
+            <w:pPr>
+              <w:pStyle w:val="Contenidodelatabla"/>
+              <w:jc w:val="start"/>
+              <w:rPr/>
+            </w:pPr>
+            <w:r>
+              <w:rPr>
+                <w:rStyle w:val="Strong"/>
+              </w:rPr>
+              <w:t>train6</w:t>
+            </w:r>
+          </w:p>
+        </w:tc>
+        <w:tc>
+          <w:tcPr>
+            <w:tcW w:w="1206" w:type="dxa"/>
+            <w:tcBorders/>
+            <w:vAlign w:val="center"/>
+          </w:tcPr>
+          <w:p>
+            <w:pPr>
+              <w:pStyle w:val="Contenidodelatabla"/>
+              <w:jc w:val="start"/>
+              <w:rPr/>
+            </w:pPr>
+            <w:r>
+              <w:rPr/>
+              <w:t>yolo26m.pt</w:t>
+            </w:r>
+          </w:p>
+        </w:tc>
+        <w:tc>
+          <w:tcPr>
+            <w:tcW w:w="1226" w:type="dxa"/>
+            <w:tcBorders/>
+            <w:vAlign w:val="center"/>
+          </w:tcPr>
+          <w:p>
+            <w:pPr>
+              <w:pStyle w:val="Contenidodelatabla"/>
+              <w:jc w:val="start"/>
+              <w:rPr/>
+            </w:pPr>
+            <w:r>
+              <w:rPr/>
+              <w:t>640</w:t>
+            </w:r>
+          </w:p>
+        </w:tc>
+        <w:tc>
+          <w:tcPr>
+            <w:tcW w:w="892" w:type="dxa"/>
+            <w:tcBorders/>
+            <w:vAlign w:val="center"/>
+          </w:tcPr>
+          <w:p>
+            <w:pPr>
+              <w:pStyle w:val="Contenidodelatabla"/>
+              <w:jc w:val="start"/>
+              <w:rPr/>
+            </w:pPr>
+            <w:r>
+              <w:rPr/>
+              <w:t>13</w:t>
+            </w:r>
+          </w:p>
+        </w:tc>
+        <w:tc>
+          <w:tcPr>
+            <w:tcW w:w="865" w:type="dxa"/>
+            <w:tcBorders/>
+            <w:vAlign w:val="center"/>
+          </w:tcPr>
+          <w:p>
+            <w:pPr>
+              <w:pStyle w:val="Contenidodelatabla"/>
+              <w:jc w:val="start"/>
+              <w:rPr/>
+            </w:pPr>
+            <w:r>
+              <w:rPr>
+                <w:rStyle w:val="Strong"/>
+              </w:rPr>
+              <w:t>0.7994</w:t>
+            </w:r>
+          </w:p>
+        </w:tc>
+        <w:tc>
+          <w:tcPr>
+            <w:tcW w:w="944" w:type="dxa"/>
+            <w:tcBorders/>
+            <w:vAlign w:val="center"/>
+          </w:tcPr>
+          <w:p>
+            <w:pPr>
+              <w:pStyle w:val="Contenidodelatabla"/>
+              <w:jc w:val="start"/>
+              <w:rPr/>
+            </w:pPr>
+            <w:r>
+              <w:rPr/>
+              <w:t>0.5368</w:t>
+            </w:r>
+          </w:p>
+        </w:tc>
+        <w:tc>
+          <w:tcPr>
+            <w:tcW w:w="1093" w:type="dxa"/>
+            <w:tcBorders/>
+            <w:vAlign w:val="center"/>
+          </w:tcPr>
+          <w:p>
+            <w:pPr>
+              <w:pStyle w:val="Contenidodelatabla"/>
+              <w:jc w:val="start"/>
+              <w:rPr/>
+            </w:pPr>
+            <w:r>
+              <w:rPr/>
+              <w:t>0.8162</w:t>
+            </w:r>
+          </w:p>
+        </w:tc>
+      </w:tr>
+      <w:tr>
+        <w:trPr/>
+        <w:tc>
+          <w:tcPr>
+            <w:tcW w:w="4081" w:type="dxa"/>
+            <w:tcBorders/>
+            <w:vAlign w:val="center"/>
+          </w:tcPr>
+          <w:p>
+            <w:pPr>
+              <w:pStyle w:val="Contenidodelatabla"/>
+              <w:jc w:val="start"/>
+              <w:rPr/>
+            </w:pPr>
+            <w:r>
+              <w:rPr>
+                <w:rStyle w:val="Strong"/>
+              </w:rPr>
+              <w:t>train4</w:t>
+            </w:r>
+          </w:p>
+        </w:tc>
+        <w:tc>
+          <w:tcPr>
+            <w:tcW w:w="1206" w:type="dxa"/>
+            <w:tcBorders/>
+            <w:vAlign w:val="center"/>
+          </w:tcPr>
+          <w:p>
+            <w:pPr>
+              <w:pStyle w:val="Contenidodelatabla"/>
+              <w:jc w:val="start"/>
+              <w:rPr/>
+            </w:pPr>
+            <w:r>
+              <w:rPr/>
+              <w:t>yolo26m.pt</w:t>
+            </w:r>
+          </w:p>
+        </w:tc>
+        <w:tc>
+          <w:tcPr>
+            <w:tcW w:w="1226" w:type="dxa"/>
+            <w:tcBorders/>
+            <w:vAlign w:val="center"/>
+          </w:tcPr>
+          <w:p>
+            <w:pPr>
+              <w:pStyle w:val="Contenidodelatabla"/>
+              <w:jc w:val="start"/>
+              <w:rPr/>
+            </w:pPr>
+            <w:r>
+              <w:rPr/>
+              <w:t>640</w:t>
+            </w:r>
+          </w:p>
+        </w:tc>
+        <w:tc>
+          <w:tcPr>
+            <w:tcW w:w="892" w:type="dxa"/>
+            <w:tcBorders/>
+            <w:vAlign w:val="center"/>
+          </w:tcPr>
+          <w:p>
+            <w:pPr>
+              <w:pStyle w:val="Contenidodelatabla"/>
+              <w:jc w:val="start"/>
+              <w:rPr/>
+            </w:pPr>
+            <w:r>
+              <w:rPr/>
+              <w:t>15</w:t>
+            </w:r>
+          </w:p>
+        </w:tc>
+        <w:tc>
+          <w:tcPr>
+            <w:tcW w:w="865" w:type="dxa"/>
+            <w:tcBorders/>
+            <w:vAlign w:val="center"/>
+          </w:tcPr>
+          <w:p>
+            <w:pPr>
+              <w:pStyle w:val="Contenidodelatabla"/>
+              <w:jc w:val="start"/>
+              <w:rPr/>
+            </w:pPr>
+            <w:r>
+              <w:rPr>
+                <w:rStyle w:val="Strong"/>
+              </w:rPr>
+              <w:t>0.7991</w:t>
+            </w:r>
+          </w:p>
+        </w:tc>
+        <w:tc>
+          <w:tcPr>
+            <w:tcW w:w="944" w:type="dxa"/>
+            <w:tcBorders/>
+            <w:vAlign w:val="center"/>
+          </w:tcPr>
+          <w:p>
+            <w:pPr>
+              <w:pStyle w:val="Contenidodelatabla"/>
+              <w:jc w:val="start"/>
+              <w:rPr/>
+            </w:pPr>
+            <w:r>
+              <w:rPr/>
+              <w:t>0.5508</w:t>
+            </w:r>
+          </w:p>
+        </w:tc>
+        <w:tc>
+          <w:tcPr>
+            <w:tcW w:w="1093" w:type="dxa"/>
+            <w:tcBorders/>
+            <w:vAlign w:val="center"/>
+          </w:tcPr>
+          <w:p>
+            <w:pPr>
+              <w:pStyle w:val="Contenidodelatabla"/>
+              <w:jc w:val="start"/>
+              <w:rPr/>
+            </w:pPr>
+            <w:r>
+              <w:rPr/>
+              <w:t>0.7680</w:t>
+            </w:r>
+          </w:p>
+        </w:tc>
+      </w:tr>
+      <w:tr>
+        <w:trPr/>
+        <w:tc>
+          <w:tcPr>
+            <w:tcW w:w="4081" w:type="dxa"/>
+            <w:tcBorders/>
+            <w:vAlign w:val="center"/>
+          </w:tcPr>
+          <w:p>
+            <w:pPr>
+              <w:pStyle w:val="Contenidodelatabla"/>
+              <w:jc w:val="start"/>
+              <w:rPr/>
+            </w:pPr>
+            <w:r>
+              <w:rPr>
+                <w:rStyle w:val="Strong"/>
+              </w:rPr>
+              <w:t>dental_nofreeze_suave</w:t>
+            </w:r>
+          </w:p>
+        </w:tc>
+        <w:tc>
+          <w:tcPr>
+            <w:tcW w:w="1206" w:type="dxa"/>
+            <w:tcBorders/>
+            <w:vAlign w:val="center"/>
+          </w:tcPr>
+          <w:p>
+            <w:pPr>
+              <w:pStyle w:val="Contenidodelatabla"/>
+              <w:jc w:val="start"/>
+              <w:rPr/>
+            </w:pPr>
+            <w:r>
+              <w:rPr/>
+              <w:t>yolo26n.pt</w:t>
+            </w:r>
+          </w:p>
+        </w:tc>
+        <w:tc>
+          <w:tcPr>
+            <w:tcW w:w="1226" w:type="dxa"/>
+            <w:tcBorders/>
+            <w:vAlign w:val="center"/>
+          </w:tcPr>
+          <w:p>
+            <w:pPr>
+              <w:pStyle w:val="Contenidodelatabla"/>
+              <w:jc w:val="start"/>
+              <w:rPr/>
+            </w:pPr>
+            <w:r>
+              <w:rPr/>
+              <w:t>800</w:t>
+            </w:r>
+          </w:p>
+        </w:tc>
+        <w:tc>
+          <w:tcPr>
+            <w:tcW w:w="892" w:type="dxa"/>
+            <w:tcBorders/>
+            <w:vAlign w:val="center"/>
+          </w:tcPr>
+          <w:p>
+            <w:pPr>
+              <w:pStyle w:val="Contenidodelatabla"/>
+              <w:jc w:val="start"/>
+              <w:rPr/>
+            </w:pPr>
+            <w:r>
+              <w:rPr/>
+              <w:t>79</w:t>
+            </w:r>
+          </w:p>
+        </w:tc>
+        <w:tc>
+          <w:tcPr>
+            <w:tcW w:w="865" w:type="dxa"/>
+            <w:tcBorders/>
+            <w:vAlign w:val="center"/>
+          </w:tcPr>
+          <w:p>
+            <w:pPr>
+              <w:pStyle w:val="Contenidodelatabla"/>
+              <w:jc w:val="start"/>
+              <w:rPr/>
+            </w:pPr>
+            <w:r>
+              <w:rPr>
+                <w:rStyle w:val="Strong"/>
+              </w:rPr>
+              <w:t>0.7551</w:t>
+            </w:r>
+          </w:p>
+        </w:tc>
+        <w:tc>
+          <w:tcPr>
+            <w:tcW w:w="944" w:type="dxa"/>
+            <w:tcBorders/>
+            <w:vAlign w:val="center"/>
+          </w:tcPr>
+          <w:p>
+            <w:pPr>
+              <w:pStyle w:val="Contenidodelatabla"/>
+              <w:jc w:val="start"/>
+              <w:rPr/>
+            </w:pPr>
+            <w:r>
+              <w:rPr/>
+              <w:t>0.4914</w:t>
+            </w:r>
+          </w:p>
+        </w:tc>
+        <w:tc>
+          <w:tcPr>
+            <w:tcW w:w="1093" w:type="dxa"/>
+            <w:tcBorders/>
+            <w:vAlign w:val="center"/>
+          </w:tcPr>
+          <w:p>
+            <w:pPr>
+              <w:pStyle w:val="Contenidodelatabla"/>
+              <w:jc w:val="start"/>
+              <w:rPr/>
+            </w:pPr>
+            <w:r>
+              <w:rPr/>
+              <w:t>0.8043</w:t>
+            </w:r>
+          </w:p>
+        </w:tc>
+      </w:tr>
+      <w:tr>
+        <w:trPr/>
+        <w:tc>
+          <w:tcPr>
+            <w:tcW w:w="4081" w:type="dxa"/>
+            <w:tcBorders/>
+            <w:vAlign w:val="center"/>
+          </w:tcPr>
+          <w:p>
+            <w:pPr>
+              <w:pStyle w:val="Contenidodelatabla"/>
+              <w:jc w:val="start"/>
+              <w:rPr/>
+            </w:pPr>
+            <w:r>
+              <w:rPr>
+                <w:rStyle w:val="Strong"/>
+              </w:rPr>
+              <w:t>dental_alta_resolucion</w:t>
+            </w:r>
+          </w:p>
+        </w:tc>
+        <w:tc>
+          <w:tcPr>
+            <w:tcW w:w="1206" w:type="dxa"/>
+            <w:tcBorders/>
+            <w:vAlign w:val="center"/>
+          </w:tcPr>
+          <w:p>
+            <w:pPr>
+              <w:pStyle w:val="Contenidodelatabla"/>
+              <w:jc w:val="start"/>
+              <w:rPr/>
+            </w:pPr>
+            <w:r>
+              <w:rPr/>
+              <w:t>yolo26n.pt</w:t>
+            </w:r>
+          </w:p>
+        </w:tc>
+        <w:tc>
+          <w:tcPr>
+            <w:tcW w:w="1226" w:type="dxa"/>
+            <w:tcBorders/>
+            <w:vAlign w:val="center"/>
+          </w:tcPr>
+          <w:p>
+            <w:pPr>
+              <w:pStyle w:val="Contenidodelatabla"/>
+              <w:jc w:val="start"/>
+              <w:rPr/>
+            </w:pPr>
+            <w:r>
+              <w:rPr/>
+              <w:t>1024</w:t>
+            </w:r>
+          </w:p>
+        </w:tc>
+        <w:tc>
+          <w:tcPr>
+            <w:tcW w:w="892" w:type="dxa"/>
+            <w:tcBorders/>
+            <w:vAlign w:val="center"/>
+          </w:tcPr>
+          <w:p>
+            <w:pPr>
+              <w:pStyle w:val="Contenidodelatabla"/>
+              <w:jc w:val="start"/>
+              <w:rPr/>
+            </w:pPr>
+            <w:r>
+              <w:rPr/>
+              <w:t>50</w:t>
+            </w:r>
+          </w:p>
+        </w:tc>
+        <w:tc>
+          <w:tcPr>
+            <w:tcW w:w="865" w:type="dxa"/>
+            <w:tcBorders/>
+            <w:vAlign w:val="center"/>
+          </w:tcPr>
+          <w:p>
+            <w:pPr>
+              <w:pStyle w:val="Contenidodelatabla"/>
+              <w:jc w:val="start"/>
+              <w:rPr/>
+            </w:pPr>
+            <w:r>
+              <w:rPr>
+                <w:rStyle w:val="Strong"/>
+              </w:rPr>
+              <w:t>0.7413</w:t>
+            </w:r>
+          </w:p>
+        </w:tc>
+        <w:tc>
+          <w:tcPr>
+            <w:tcW w:w="944" w:type="dxa"/>
+            <w:tcBorders/>
+            <w:vAlign w:val="center"/>
+          </w:tcPr>
+          <w:p>
+            <w:pPr>
+              <w:pStyle w:val="Contenidodelatabla"/>
+              <w:jc w:val="start"/>
+              <w:rPr/>
+            </w:pPr>
+            <w:r>
+              <w:rPr/>
+              <w:t>0.4842</w:t>
+            </w:r>
+          </w:p>
+        </w:tc>
+        <w:tc>
+          <w:tcPr>
+            <w:tcW w:w="1093" w:type="dxa"/>
+            <w:tcBorders/>
+            <w:vAlign w:val="center"/>
+          </w:tcPr>
+          <w:p>
+            <w:pPr>
+              <w:pStyle w:val="Contenidodelatabla"/>
+              <w:jc w:val="start"/>
+              <w:rPr/>
+            </w:pPr>
+            <w:r>
+              <w:rPr/>
+              <w:t>0.7256</w:t>
+            </w:r>
+          </w:p>
+        </w:tc>
+      </w:tr>
+      <w:tr>
+        <w:trPr/>
+        <w:tc>
+          <w:tcPr>
+            <w:tcW w:w="4081" w:type="dxa"/>
+            <w:tcBorders/>
+            <w:vAlign w:val="center"/>
+          </w:tcPr>
+          <w:p>
+            <w:pPr>
+              <w:pStyle w:val="Contenidodelatabla"/>
+              <w:jc w:val="start"/>
+              <w:rPr/>
+            </w:pPr>
+            <w:r>
+              <w:rPr>
+                <w:rStyle w:val="Strong"/>
+              </w:rPr>
+              <w:t>dental_regularizado</w:t>
+            </w:r>
+          </w:p>
+        </w:tc>
+        <w:tc>
+          <w:tcPr>
+            <w:tcW w:w="1206" w:type="dxa"/>
+            <w:tcBorders/>
+            <w:vAlign w:val="center"/>
+          </w:tcPr>
+          <w:p>
+            <w:pPr>
+              <w:pStyle w:val="Contenidodelatabla"/>
+              <w:jc w:val="start"/>
+              <w:rPr/>
+            </w:pPr>
+            <w:r>
+              <w:rPr/>
+              <w:t>yolo26n.pt</w:t>
+            </w:r>
+          </w:p>
+        </w:tc>
+        <w:tc>
+          <w:tcPr>
+            <w:tcW w:w="1226" w:type="dxa"/>
+            <w:tcBorders/>
+            <w:vAlign w:val="center"/>
+          </w:tcPr>
+          <w:p>
+            <w:pPr>
+              <w:pStyle w:val="Contenidodelatabla"/>
+              <w:jc w:val="start"/>
+              <w:rPr/>
+            </w:pPr>
+            <w:r>
+              <w:rPr/>
+              <w:t>800</w:t>
+            </w:r>
+          </w:p>
+        </w:tc>
+        <w:tc>
+          <w:tcPr>
+            <w:tcW w:w="892" w:type="dxa"/>
+            <w:tcBorders/>
+            <w:vAlign w:val="center"/>
+          </w:tcPr>
+          <w:p>
+            <w:pPr>
+              <w:pStyle w:val="Contenidodelatabla"/>
+              <w:jc w:val="start"/>
+              <w:rPr/>
+            </w:pPr>
+            <w:r>
+              <w:rPr/>
+              <w:t>40</w:t>
+            </w:r>
+          </w:p>
+        </w:tc>
+        <w:tc>
+          <w:tcPr>
+            <w:tcW w:w="865" w:type="dxa"/>
+            <w:tcBorders/>
+            <w:vAlign w:val="center"/>
+          </w:tcPr>
+          <w:p>
+            <w:pPr>
+              <w:pStyle w:val="Contenidodelatabla"/>
+              <w:jc w:val="start"/>
+              <w:rPr/>
+            </w:pPr>
+            <w:r>
+              <w:rPr>
+                <w:rStyle w:val="Strong"/>
+              </w:rPr>
+              <w:t>0.7375</w:t>
+            </w:r>
+          </w:p>
+        </w:tc>
+        <w:tc>
+          <w:tcPr>
+            <w:tcW w:w="944" w:type="dxa"/>
+            <w:tcBorders/>
+            <w:vAlign w:val="center"/>
+          </w:tcPr>
+          <w:p>
+            <w:pPr>
+              <w:pStyle w:val="Contenidodelatabla"/>
+              <w:jc w:val="start"/>
+              <w:rPr/>
+            </w:pPr>
+            <w:r>
+              <w:rPr/>
+              <w:t>0.4771</w:t>
+            </w:r>
+          </w:p>
+        </w:tc>
+        <w:tc>
+          <w:tcPr>
+            <w:tcW w:w="1093" w:type="dxa"/>
+            <w:tcBorders/>
+            <w:vAlign w:val="center"/>
+          </w:tcPr>
+          <w:p>
+            <w:pPr>
+              <w:pStyle w:val="Contenidodelatabla"/>
+              <w:jc w:val="start"/>
+              <w:rPr/>
+            </w:pPr>
+            <w:r>
+              <w:rPr/>
+              <w:t>0.8002</w:t>
+            </w:r>
+          </w:p>
+        </w:tc>
+      </w:tr>
+      <w:tr>
+        <w:trPr/>
+        <w:tc>
+          <w:tcPr>
+            <w:tcW w:w="4081" w:type="dxa"/>
+            <w:tcBorders/>
+            <w:vAlign w:val="center"/>
+          </w:tcPr>
+          <w:p>
+            <w:pPr>
+              <w:pStyle w:val="Contenidodelatabla"/>
+              <w:jc w:val="start"/>
+              <w:rPr/>
+            </w:pPr>
+            <w:r>
+              <w:rPr>
+                <w:rStyle w:val="Strong"/>
+              </w:rPr>
+              <w:t>dental_yolo26n_laptop_freeze5</w:t>
+            </w:r>
+          </w:p>
+        </w:tc>
+        <w:tc>
+          <w:tcPr>
+            <w:tcW w:w="1206" w:type="dxa"/>
+            <w:tcBorders/>
+            <w:vAlign w:val="center"/>
+          </w:tcPr>
+          <w:p>
+            <w:pPr>
+              <w:pStyle w:val="Contenidodelatabla"/>
+              <w:jc w:val="start"/>
+              <w:rPr/>
+            </w:pPr>
+            <w:r>
+              <w:rPr/>
+              <w:t>yolo26n.pt</w:t>
+            </w:r>
+          </w:p>
+        </w:tc>
+        <w:tc>
+          <w:tcPr>
+            <w:tcW w:w="1226" w:type="dxa"/>
+            <w:tcBorders/>
+            <w:vAlign w:val="center"/>
+          </w:tcPr>
+          <w:p>
+            <w:pPr>
+              <w:pStyle w:val="Contenidodelatabla"/>
+              <w:jc w:val="start"/>
+              <w:rPr/>
+            </w:pPr>
+            <w:r>
+              <w:rPr/>
+              <w:t>800</w:t>
+            </w:r>
+          </w:p>
+        </w:tc>
+        <w:tc>
+          <w:tcPr>
+            <w:tcW w:w="892" w:type="dxa"/>
+            <w:tcBorders/>
+            <w:vAlign w:val="center"/>
+          </w:tcPr>
+          <w:p>
+            <w:pPr>
+              <w:pStyle w:val="Contenidodelatabla"/>
+              <w:jc w:val="start"/>
+              <w:rPr/>
+            </w:pPr>
+            <w:r>
+              <w:rPr/>
+              <w:t>66</w:t>
+            </w:r>
+          </w:p>
+        </w:tc>
+        <w:tc>
+          <w:tcPr>
+            <w:tcW w:w="865" w:type="dxa"/>
+            <w:tcBorders/>
+            <w:vAlign w:val="center"/>
+          </w:tcPr>
+          <w:p>
+            <w:pPr>
+              <w:pStyle w:val="Contenidodelatabla"/>
+              <w:jc w:val="start"/>
+              <w:rPr/>
+            </w:pPr>
+            <w:r>
+              <w:rPr>
+                <w:rStyle w:val="Strong"/>
+              </w:rPr>
+              <w:t>0.7342</w:t>
+            </w:r>
+          </w:p>
+        </w:tc>
+        <w:tc>
+          <w:tcPr>
+            <w:tcW w:w="944" w:type="dxa"/>
+            <w:tcBorders/>
+            <w:vAlign w:val="center"/>
+          </w:tcPr>
+          <w:p>
+            <w:pPr>
+              <w:pStyle w:val="Contenidodelatabla"/>
+              <w:jc w:val="start"/>
+              <w:rPr/>
+            </w:pPr>
+            <w:r>
+              <w:rPr/>
+              <w:t>0.4752</w:t>
+            </w:r>
+          </w:p>
+        </w:tc>
+        <w:tc>
+          <w:tcPr>
+            <w:tcW w:w="1093" w:type="dxa"/>
+            <w:tcBorders/>
+            <w:vAlign w:val="center"/>
+          </w:tcPr>
+          <w:p>
+            <w:pPr>
+              <w:pStyle w:val="Contenidodelatabla"/>
+              <w:jc w:val="start"/>
+              <w:rPr/>
+            </w:pPr>
+            <w:r>
+              <w:rPr/>
+              <w:t>0.6819</w:t>
+            </w:r>
+          </w:p>
+        </w:tc>
+      </w:tr>
+      <w:tr>
+        <w:trPr/>
+        <w:tc>
+          <w:tcPr>
+            <w:tcW w:w="4081" w:type="dxa"/>
+            <w:tcBorders/>
+            <w:vAlign w:val="center"/>
+          </w:tcPr>
+          <w:p>
+            <w:pPr>
+              <w:pStyle w:val="Contenidodelatabla"/>
+              <w:jc w:val="start"/>
+              <w:rPr/>
+            </w:pPr>
+            <w:r>
+              <w:rPr>
+                <w:rStyle w:val="Strong"/>
+              </w:rPr>
+              <w:t>dental_definitivo</w:t>
+            </w:r>
+          </w:p>
+        </w:tc>
+        <w:tc>
+          <w:tcPr>
+            <w:tcW w:w="1206" w:type="dxa"/>
+            <w:tcBorders/>
+            <w:vAlign w:val="center"/>
+          </w:tcPr>
+          <w:p>
+            <w:pPr>
+              <w:pStyle w:val="Contenidodelatabla"/>
+              <w:jc w:val="start"/>
+              <w:rPr/>
+            </w:pPr>
+            <w:r>
+              <w:rPr/>
+              <w:t>yolo26n.pt</w:t>
+            </w:r>
+          </w:p>
+        </w:tc>
+        <w:tc>
+          <w:tcPr>
+            <w:tcW w:w="1226" w:type="dxa"/>
+            <w:tcBorders/>
+            <w:vAlign w:val="center"/>
+          </w:tcPr>
+          <w:p>
+            <w:pPr>
+              <w:pStyle w:val="Contenidodelatabla"/>
+              <w:jc w:val="start"/>
+              <w:rPr/>
+            </w:pPr>
+            <w:r>
+              <w:rPr/>
+              <w:t>1024</w:t>
+            </w:r>
+          </w:p>
+        </w:tc>
+        <w:tc>
+          <w:tcPr>
+            <w:tcW w:w="892" w:type="dxa"/>
+            <w:tcBorders/>
+            <w:vAlign w:val="center"/>
+          </w:tcPr>
+          <w:p>
+            <w:pPr>
+              <w:pStyle w:val="Contenidodelatabla"/>
+              <w:jc w:val="start"/>
+              <w:rPr/>
+            </w:pPr>
+            <w:r>
+              <w:rPr/>
+              <w:t>49</w:t>
+            </w:r>
+          </w:p>
+        </w:tc>
+        <w:tc>
+          <w:tcPr>
+            <w:tcW w:w="865" w:type="dxa"/>
+            <w:tcBorders/>
+            <w:vAlign w:val="center"/>
+          </w:tcPr>
+          <w:p>
+            <w:pPr>
+              <w:pStyle w:val="Contenidodelatabla"/>
+              <w:jc w:val="start"/>
+              <w:rPr/>
+            </w:pPr>
+            <w:r>
+              <w:rPr>
+                <w:rStyle w:val="Strong"/>
+              </w:rPr>
+              <w:t>0.7208</w:t>
+            </w:r>
+          </w:p>
+        </w:tc>
+        <w:tc>
+          <w:tcPr>
+            <w:tcW w:w="944" w:type="dxa"/>
+            <w:tcBorders/>
+            <w:vAlign w:val="center"/>
+          </w:tcPr>
+          <w:p>
+            <w:pPr>
+              <w:pStyle w:val="Contenidodelatabla"/>
+              <w:jc w:val="start"/>
+              <w:rPr/>
+            </w:pPr>
+            <w:r>
+              <w:rPr/>
+              <w:t>0.4727</w:t>
+            </w:r>
+          </w:p>
+        </w:tc>
+        <w:tc>
+          <w:tcPr>
+            <w:tcW w:w="1093" w:type="dxa"/>
+            <w:tcBorders/>
+            <w:vAlign w:val="center"/>
+          </w:tcPr>
+          <w:p>
+            <w:pPr>
+              <w:pStyle w:val="Contenidodelatabla"/>
+              <w:jc w:val="start"/>
+              <w:rPr/>
+            </w:pPr>
+            <w:r>
+              <w:rPr/>
+              <w:t>0.7582</w:t>
+            </w:r>
+          </w:p>
+        </w:tc>
+      </w:tr>
+      <w:tr>
+        <w:trPr/>
+        <w:tc>
+          <w:tcPr>
+            <w:tcW w:w="4081" w:type="dxa"/>
+            <w:tcBorders/>
+            <w:vAlign w:val="center"/>
+          </w:tcPr>
+          <w:p>
+            <w:pPr>
+              <w:pStyle w:val="Contenidodelatabla"/>
+              <w:jc w:val="start"/>
+              <w:rPr/>
+            </w:pPr>
+            <w:r>
+              <w:rPr>
+                <w:rStyle w:val="Strong"/>
+              </w:rPr>
+              <w:t>dental_yolov8</w:t>
+            </w:r>
+          </w:p>
+        </w:tc>
+        <w:tc>
+          <w:tcPr>
+            <w:tcW w:w="1206" w:type="dxa"/>
+            <w:tcBorders/>
+            <w:vAlign w:val="center"/>
+          </w:tcPr>
+          <w:p>
+            <w:pPr>
+              <w:pStyle w:val="Contenidodelatabla"/>
+              <w:jc w:val="start"/>
+              <w:rPr/>
+            </w:pPr>
+            <w:r>
+              <w:rPr/>
+              <w:t>yolo26n.pt</w:t>
+            </w:r>
+          </w:p>
+        </w:tc>
+        <w:tc>
+          <w:tcPr>
+            <w:tcW w:w="1226" w:type="dxa"/>
+            <w:tcBorders/>
+            <w:vAlign w:val="center"/>
+          </w:tcPr>
+          <w:p>
+            <w:pPr>
+              <w:pStyle w:val="Contenidodelatabla"/>
+              <w:jc w:val="start"/>
+              <w:rPr/>
+            </w:pPr>
+            <w:r>
+              <w:rPr/>
+              <w:t>640</w:t>
+            </w:r>
+          </w:p>
+        </w:tc>
+        <w:tc>
+          <w:tcPr>
+            <w:tcW w:w="892" w:type="dxa"/>
+            <w:tcBorders/>
+            <w:vAlign w:val="center"/>
+          </w:tcPr>
+          <w:p>
+            <w:pPr>
+              <w:pStyle w:val="Contenidodelatabla"/>
+              <w:jc w:val="start"/>
+              <w:rPr/>
+            </w:pPr>
+            <w:r>
+              <w:rPr/>
+              <w:t>44</w:t>
+            </w:r>
+          </w:p>
+        </w:tc>
+        <w:tc>
+          <w:tcPr>
+            <w:tcW w:w="865" w:type="dxa"/>
+            <w:tcBorders/>
+            <w:vAlign w:val="center"/>
+          </w:tcPr>
+          <w:p>
+            <w:pPr>
+              <w:pStyle w:val="Contenidodelatabla"/>
+              <w:jc w:val="start"/>
+              <w:rPr/>
+            </w:pPr>
+            <w:r>
+              <w:rPr>
+                <w:rStyle w:val="Strong"/>
+              </w:rPr>
+              <w:t>0.7179</w:t>
+            </w:r>
+          </w:p>
+        </w:tc>
+        <w:tc>
+          <w:tcPr>
+            <w:tcW w:w="944" w:type="dxa"/>
+            <w:tcBorders/>
+            <w:vAlign w:val="center"/>
+          </w:tcPr>
+          <w:p>
+            <w:pPr>
+              <w:pStyle w:val="Contenidodelatabla"/>
+              <w:jc w:val="start"/>
+              <w:rPr/>
+            </w:pPr>
+            <w:r>
+              <w:rPr/>
+              <w:t>0.4686</w:t>
+            </w:r>
+          </w:p>
+        </w:tc>
+        <w:tc>
+          <w:tcPr>
+            <w:tcW w:w="1093" w:type="dxa"/>
+            <w:tcBorders/>
+            <w:vAlign w:val="center"/>
+          </w:tcPr>
+          <w:p>
+            <w:pPr>
+              <w:pStyle w:val="Contenidodelatabla"/>
+              <w:jc w:val="start"/>
+              <w:rPr/>
+            </w:pPr>
+            <w:r>
+              <w:rPr/>
+              <w:t>0.6805</w:t>
+            </w:r>
+          </w:p>
+        </w:tc>
+      </w:tr>
+      <w:tr>
+        <w:trPr/>
+        <w:tc>
+          <w:tcPr>
+            <w:tcW w:w="4081" w:type="dxa"/>
+            <w:tcBorders/>
+            <w:vAlign w:val="center"/>
+          </w:tcPr>
+          <w:p>
+            <w:pPr>
+              <w:pStyle w:val="Contenidodelatabla"/>
+              <w:jc w:val="start"/>
+              <w:rPr/>
+            </w:pPr>
+            <w:r>
+              <w:rPr>
+                <w:rStyle w:val="Strong"/>
+              </w:rPr>
+              <w:t>dental_yolo26n_laptop</w:t>
+            </w:r>
+          </w:p>
+        </w:tc>
+        <w:tc>
+          <w:tcPr>
+            <w:tcW w:w="1206" w:type="dxa"/>
+            <w:tcBorders/>
+            <w:vAlign w:val="center"/>
+          </w:tcPr>
+          <w:p>
+            <w:pPr>
+              <w:pStyle w:val="Contenidodelatabla"/>
+              <w:jc w:val="start"/>
+              <w:rPr/>
+            </w:pPr>
+            <w:r>
+              <w:rPr/>
+              <w:t>yolo26n.pt</w:t>
+            </w:r>
+          </w:p>
+        </w:tc>
+        <w:tc>
+          <w:tcPr>
+            <w:tcW w:w="1226" w:type="dxa"/>
+            <w:tcBorders/>
+            <w:vAlign w:val="center"/>
+          </w:tcPr>
+          <w:p>
+            <w:pPr>
+              <w:pStyle w:val="Contenidodelatabla"/>
+              <w:jc w:val="start"/>
+              <w:rPr/>
+            </w:pPr>
+            <w:r>
+              <w:rPr/>
+              <w:t>800</w:t>
+            </w:r>
+          </w:p>
+        </w:tc>
+        <w:tc>
+          <w:tcPr>
+            <w:tcW w:w="892" w:type="dxa"/>
+            <w:tcBorders/>
+            <w:vAlign w:val="center"/>
+          </w:tcPr>
+          <w:p>
+            <w:pPr>
+              <w:pStyle w:val="Contenidodelatabla"/>
+              <w:jc w:val="start"/>
+              <w:rPr/>
+            </w:pPr>
+            <w:r>
+              <w:rPr/>
+              <w:t>80</w:t>
+            </w:r>
+          </w:p>
+        </w:tc>
+        <w:tc>
+          <w:tcPr>
+            <w:tcW w:w="865" w:type="dxa"/>
+            <w:tcBorders/>
+            <w:vAlign w:val="center"/>
+          </w:tcPr>
+          <w:p>
+            <w:pPr>
+              <w:pStyle w:val="Contenidodelatabla"/>
+              <w:jc w:val="start"/>
+              <w:rPr/>
+            </w:pPr>
+            <w:r>
+              <w:rPr>
+                <w:rStyle w:val="Strong"/>
+              </w:rPr>
+              <w:t>0.6935</w:t>
+            </w:r>
+          </w:p>
+        </w:tc>
+        <w:tc>
+          <w:tcPr>
+            <w:tcW w:w="944" w:type="dxa"/>
+            <w:tcBorders/>
+            <w:vAlign w:val="center"/>
+          </w:tcPr>
+          <w:p>
+            <w:pPr>
+              <w:pStyle w:val="Contenidodelatabla"/>
+              <w:jc w:val="start"/>
+              <w:rPr/>
+            </w:pPr>
+            <w:r>
+              <w:rPr/>
+              <w:t>0.4664</w:t>
+            </w:r>
+          </w:p>
+        </w:tc>
+        <w:tc>
+          <w:tcPr>
+            <w:tcW w:w="1093" w:type="dxa"/>
+            <w:tcBorders/>
+            <w:vAlign w:val="center"/>
+          </w:tcPr>
+          <w:p>
+            <w:pPr>
+              <w:pStyle w:val="Contenidodelatabla"/>
+              <w:jc w:val="start"/>
+              <w:rPr/>
+            </w:pPr>
+            <w:r>
+              <w:rPr/>
+              <w:t>0.6590</w:t>
+            </w:r>
+          </w:p>
+        </w:tc>
+      </w:tr>
+      <w:tr>
+        <w:trPr/>
+        <w:tc>
+          <w:tcPr>
+            <w:tcW w:w="4081" w:type="dxa"/>
+            <w:tcBorders/>
+            <w:vAlign w:val="center"/>
+          </w:tcPr>
+          <w:p>
+            <w:pPr>
+              <w:pStyle w:val="Contenidodelatabla"/>
+              <w:jc w:val="start"/>
+              <w:rPr/>
+            </w:pPr>
+            <w:r>
+              <w:rPr>
+                <w:rStyle w:val="Strong"/>
+              </w:rPr>
+              <w:t>train2</w:t>
+            </w:r>
+          </w:p>
+        </w:tc>
+        <w:tc>
+          <w:tcPr>
+            <w:tcW w:w="1206" w:type="dxa"/>
+            <w:tcBorders/>
+            <w:vAlign w:val="center"/>
+          </w:tcPr>
+          <w:p>
+            <w:pPr>
+              <w:pStyle w:val="Contenidodelatabla"/>
+              <w:jc w:val="start"/>
+              <w:rPr/>
+            </w:pPr>
+            <w:r>
+              <w:rPr/>
+              <w:t>yolo26n.pt</w:t>
+            </w:r>
+          </w:p>
+        </w:tc>
+        <w:tc>
+          <w:tcPr>
+            <w:tcW w:w="1226" w:type="dxa"/>
+            <w:tcBorders/>
+            <w:vAlign w:val="center"/>
+          </w:tcPr>
+          <w:p>
+            <w:pPr>
+              <w:pStyle w:val="Contenidodelatabla"/>
+              <w:jc w:val="start"/>
+              <w:rPr/>
+            </w:pPr>
+            <w:r>
+              <w:rPr/>
+              <w:t>640</w:t>
+            </w:r>
+          </w:p>
+        </w:tc>
+        <w:tc>
+          <w:tcPr>
+            <w:tcW w:w="892" w:type="dxa"/>
+            <w:tcBorders/>
+            <w:vAlign w:val="center"/>
+          </w:tcPr>
+          <w:p>
+            <w:pPr>
+              <w:pStyle w:val="Contenidodelatabla"/>
+              <w:jc w:val="start"/>
+              <w:rPr/>
+            </w:pPr>
+            <w:r>
+              <w:rPr/>
+              <w:t>15</w:t>
+            </w:r>
+          </w:p>
+        </w:tc>
+        <w:tc>
+          <w:tcPr>
+            <w:tcW w:w="865" w:type="dxa"/>
+            <w:tcBorders/>
+            <w:vAlign w:val="center"/>
+          </w:tcPr>
+          <w:p>
+            <w:pPr>
+              <w:pStyle w:val="Contenidodelatabla"/>
+              <w:jc w:val="start"/>
+              <w:rPr/>
+            </w:pPr>
+            <w:r>
+              <w:rPr>
+                <w:rStyle w:val="Strong"/>
+              </w:rPr>
+              <w:t>0.6255</w:t>
+            </w:r>
+          </w:p>
+        </w:tc>
+        <w:tc>
+          <w:tcPr>
+            <w:tcW w:w="944" w:type="dxa"/>
+            <w:tcBorders/>
+            <w:vAlign w:val="center"/>
+          </w:tcPr>
+          <w:p>
+            <w:pPr>
+              <w:pStyle w:val="Contenidodelatabla"/>
+              <w:jc w:val="start"/>
+              <w:rPr/>
+            </w:pPr>
+            <w:r>
+              <w:rPr/>
+              <w:t>0.4194</w:t>
+            </w:r>
+          </w:p>
+        </w:tc>
+        <w:tc>
+          <w:tcPr>
+            <w:tcW w:w="1093" w:type="dxa"/>
+            <w:tcBorders/>
+            <w:vAlign w:val="center"/>
+          </w:tcPr>
+          <w:p>
+            <w:pPr>
+              <w:pStyle w:val="Contenidodelatabla"/>
+              <w:jc w:val="start"/>
+              <w:rPr/>
+            </w:pPr>
+            <w:r>
+              <w:rPr/>
+              <w:t>0.6123</w:t>
+            </w:r>
+          </w:p>
+        </w:tc>
+      </w:tr>
+      <w:tr>
+        <w:trPr/>
+        <w:tc>
+          <w:tcPr>
+            <w:tcW w:w="4081" w:type="dxa"/>
+            <w:tcBorders/>
+            <w:vAlign w:val="center"/>
+          </w:tcPr>
+          <w:p>
+            <w:pPr>
+              <w:pStyle w:val="Contenidodelatabla"/>
+              <w:jc w:val="start"/>
+              <w:rPr/>
+            </w:pPr>
+            <w:r>
+              <w:rPr>
+                <w:rStyle w:val="Strong"/>
+              </w:rPr>
+              <w:t>train</w:t>
+            </w:r>
+          </w:p>
+        </w:tc>
+        <w:tc>
+          <w:tcPr>
+            <w:tcW w:w="1206" w:type="dxa"/>
+            <w:tcBorders/>
+            <w:vAlign w:val="center"/>
+          </w:tcPr>
+          <w:p>
+            <w:pPr>
+              <w:pStyle w:val="Contenidodelatabla"/>
+              <w:jc w:val="start"/>
+              <w:rPr/>
+            </w:pPr>
+            <w:r>
+              <w:rPr/>
+              <w:t>yolo26n.pt</w:t>
+            </w:r>
+          </w:p>
+        </w:tc>
+        <w:tc>
+          <w:tcPr>
+            <w:tcW w:w="1226" w:type="dxa"/>
+            <w:tcBorders/>
+            <w:vAlign w:val="center"/>
+          </w:tcPr>
+          <w:p>
+            <w:pPr>
+              <w:pStyle w:val="Contenidodelatabla"/>
+              <w:jc w:val="start"/>
+              <w:rPr/>
+            </w:pPr>
+            <w:r>
+              <w:rPr/>
+              <w:t>640</w:t>
+            </w:r>
+          </w:p>
+        </w:tc>
+        <w:tc>
+          <w:tcPr>
+            <w:tcW w:w="892" w:type="dxa"/>
+            <w:tcBorders/>
+            <w:vAlign w:val="center"/>
+          </w:tcPr>
+          <w:p>
+            <w:pPr>
+              <w:pStyle w:val="Contenidodelatabla"/>
+              <w:jc w:val="start"/>
+              <w:rPr/>
+            </w:pPr>
+            <w:r>
+              <w:rPr/>
+              <w:t>4</w:t>
+            </w:r>
+          </w:p>
+        </w:tc>
+        <w:tc>
+          <w:tcPr>
+            <w:tcW w:w="865" w:type="dxa"/>
+            <w:tcBorders/>
+            <w:vAlign w:val="center"/>
+          </w:tcPr>
+          <w:p>
+            <w:pPr>
+              <w:pStyle w:val="Contenidodelatabla"/>
+              <w:jc w:val="start"/>
+              <w:rPr/>
+            </w:pPr>
+            <w:r>
+              <w:rPr>
+                <w:rStyle w:val="Strong"/>
+              </w:rPr>
+              <w:t>0.4849</w:t>
+            </w:r>
+          </w:p>
+        </w:tc>
+        <w:tc>
+          <w:tcPr>
+            <w:tcW w:w="944" w:type="dxa"/>
+            <w:tcBorders/>
+            <w:vAlign w:val="center"/>
+          </w:tcPr>
+          <w:p>
+            <w:pPr>
+              <w:pStyle w:val="Contenidodelatabla"/>
+              <w:jc w:val="start"/>
+              <w:rPr/>
+            </w:pPr>
+            <w:r>
+              <w:rPr/>
+              <w:t>0.3123</w:t>
+            </w:r>
+          </w:p>
+        </w:tc>
+        <w:tc>
+          <w:tcPr>
+            <w:tcW w:w="1093" w:type="dxa"/>
+            <w:tcBorders/>
+            <w:vAlign w:val="center"/>
+          </w:tcPr>
+          <w:p>
+            <w:pPr>
+              <w:pStyle w:val="Contenidodelatabla"/>
+              <w:jc w:val="start"/>
+              <w:rPr/>
+            </w:pPr>
+            <w:r>
+              <w:rPr/>
+              <w:t>0.7269</w:t>
+            </w:r>
+          </w:p>
+        </w:tc>
+      </w:tr>
+    </w:tbl>
+    <w:p>
+      <w:pPr>
+        <w:pStyle w:val="BodyText"/>
+        <w:spacing w:before="0" w:after="283"/>
+        <w:rPr/>
+      </w:pPr>
+      <w:r>
+        <w:rPr>
+          <w:rStyle w:val="Emphasis"/>
+        </w:rPr>
+        <w:t>(Datos consolidados de la comparativa general extraída de los reportes del sistema)</w:t>
+      </w:r>
+    </w:p>
+    <w:p>
+      <w:pPr>
+        <w:pStyle w:val="Heading1"/>
+        <w:numPr>
+          <w:ilvl w:val="0"/>
+          <w:numId w:val="2"/>
+        </w:numPr>
+        <w:ind w:hanging="0" w:start="0"/>
+        <w:rPr/>
+      </w:pPr>
+      <w:r>
+        <w:rPr>
+          <w:rStyle w:val="Emphasis"/>
+        </w:rPr>
+        <w:t>Que quiere decir mAP50?</w:t>
+      </w:r>
+    </w:p>
+    <w:p>
+      <w:pPr>
+        <w:pStyle w:val="BodyText"/>
+        <w:spacing w:before="0" w:after="283"/>
+        <w:rPr/>
+      </w:pPr>
+      <w:r>
+        <w:rPr>
+          <w:rStyle w:val="Emphasis"/>
+        </w:rPr>
+        <w:t xml:space="preserve">En los documentos proporcionados, el </w:t>
+      </w:r>
+      <w:r>
+        <w:rPr>
+          <w:rStyle w:val="Strong"/>
+        </w:rPr>
+        <w:t>mAP50</w:t>
+      </w:r>
+      <w:r>
+        <w:rPr>
+          <w:rStyle w:val="Emphasis"/>
+        </w:rPr>
+        <w:t xml:space="preserve"> se define prácticamente como el indicador de la </w:t>
+      </w:r>
+      <w:r>
+        <w:rPr>
+          <w:rStyle w:val="Strong"/>
+        </w:rPr>
+        <w:t>"Calidad Global"</w:t>
+      </w:r>
+      <w:r>
+        <w:rPr>
+          <w:rStyle w:val="Emphasis"/>
+        </w:rPr>
+        <w:t xml:space="preserve"> o la </w:t>
+      </w:r>
+      <w:r>
+        <w:rPr>
+          <w:rStyle w:val="Strong"/>
+        </w:rPr>
+        <w:t>"precisión general"</w:t>
+      </w:r>
+      <w:r>
+        <w:rPr>
+          <w:rStyle w:val="Emphasis"/>
+        </w:rPr>
+        <w:t xml:space="preserve"> del modelo de inteligencia artificial.</w:t>
+      </w:r>
+    </w:p>
+    <w:p>
+      <w:pPr>
+        <w:pStyle w:val="BodyText"/>
+        <w:spacing w:before="0" w:after="283"/>
+        <w:rPr/>
+      </w:pPr>
+      <w:r>
+        <w:rPr/>
+        <w:t xml:space="preserve">Es una métrica fundamental en visión por computadora que evalúa la capacidad del modelo para detectar correctamente los problemas en las radiografías (como caries, implantes o empastes). Un valor más alto de mAP50 significa que </w:t>
+      </w:r>
+      <w:r>
+        <w:rPr>
+          <w:rStyle w:val="Strong"/>
+        </w:rPr>
+        <w:t>el modelo es mucho más preciso y "se equivoca muchísimo menos al hacer detecciones"</w:t>
+      </w:r>
+      <w:r>
+        <w:rPr/>
+        <w:t>.</w:t>
+      </w:r>
+    </w:p>
+    <w:p>
+      <w:pPr>
+        <w:pStyle w:val="BodyText"/>
+        <w:spacing w:before="0" w:after="283"/>
+        <w:rPr/>
+      </w:pPr>
+      <w:r>
+        <w:rPr/>
+        <w:t>En resumen, el mAP50 refleja qué tan bien equilibrado está el modelo para lograr dos cosas al mismo tiempo: no saltarse los problemas reales (alto Recall) y no generar falsas alarmas marcando zonas sanas como si estuvieran mal (alta Precisión).</w:t>
+      </w:r>
+    </w:p>
+    <w:p>
+      <w:pPr>
+        <w:pStyle w:val="BodyText"/>
+        <w:spacing w:before="0" w:after="283"/>
+        <w:rPr>
+          <w:rStyle w:val="Emphasis"/>
+        </w:rPr>
+      </w:pPr>
+      <w:r>
+        <w:rPr/>
+      </w:r>
+    </w:p>
+    <w:p>
+      <w:pPr>
+        <w:pStyle w:val="Heading1"/>
+        <w:numPr>
+          <w:ilvl w:val="0"/>
+          <w:numId w:val="2"/>
+        </w:numPr>
+        <w:ind w:hanging="0" w:start="0"/>
+        <w:rPr/>
+      </w:pPr>
+      <w:r>
+        <w:rPr/>
+        <w:t xml:space="preserve">Y mAP50-95? </w:t>
+      </w:r>
+    </w:p>
+    <w:p>
+      <w:pPr>
+        <w:pStyle w:val="BodyText"/>
+        <w:rPr/>
+      </w:pPr>
+      <w:r>
+        <w:rPr/>
+        <w:t xml:space="preserve">Mientras que el mAP50 indica si el modelo logró encontrar un problema o no, el </w:t>
+      </w:r>
+      <w:r>
+        <w:rPr>
+          <w:rStyle w:val="Strong"/>
+        </w:rPr>
+        <w:t>mAP50-95</w:t>
+      </w:r>
+      <w:r>
+        <w:rPr/>
+        <w:t xml:space="preserve"> es una métrica de evaluación mucho más estricta que mide la </w:t>
+      </w:r>
+      <w:r>
+        <w:rPr>
+          <w:rStyle w:val="Strong"/>
+        </w:rPr>
+        <w:t>precisión exacta de las cajas delimitadoras</w:t>
+      </w:r>
+      <w:r>
+        <w:rPr/>
+        <w:t xml:space="preserve"> (los recuadros que dibuja la IA sobre la radiografía).</w:t>
+      </w:r>
+    </w:p>
+    <w:p>
+      <w:pPr>
+        <w:pStyle w:val="BodyText"/>
+        <w:rPr/>
+      </w:pPr>
+      <w:r>
+        <w:rPr/>
+        <w:t xml:space="preserve">En resumen, un valor alto de mAP50-95 significa que el modelo no solo detecta correctamente la existencia de un problema dental, sino que </w:t>
+      </w:r>
+      <w:r>
+        <w:rPr>
+          <w:rStyle w:val="Strong"/>
+        </w:rPr>
+        <w:t>ajusta el recuadro perfectamente a los bordes reales del problema</w:t>
+      </w:r>
+      <w:r>
+        <w:rPr/>
+        <w:t>, evitando dibujar cajas demasiado grandes, sueltas o descentradas. Es el indicador definitivo de qué tan "ajustada a la realidad" está la detección visual de la IA.</w:t>
+      </w:r>
+    </w:p>
+    <w:p>
+      <w:pPr>
+        <w:pStyle w:val="BodyText"/>
+        <w:rPr/>
+      </w:pPr>
+      <w:r>
+        <w:rPr/>
+      </w:r>
+    </w:p>
+    <w:p>
+      <w:pPr>
+        <w:pStyle w:val="BodyText"/>
+        <w:spacing w:before="0" w:after="140"/>
+        <w:rPr/>
+      </w:pPr>
+      <w:r>
+        <w:rPr/>
       </w:r>
     </w:p>
     <w:sectPr>
@@ -9391,6 +11826,280 @@
     </w:lvl>
   </w:abstractNum>
   <w:abstractNum w:abstractNumId="26">
+    <w:lvl w:ilvl="0">
+      <w:start w:val="1"/>
+      <w:numFmt w:val="bullet"/>
+      <w:lvlText w:val=""/>
+      <w:lvlJc w:val="start"/>
+      <w:pPr>
+        <w:tabs>
+          <w:tab w:val="num" w:pos="709"/>
+        </w:tabs>
+        <w:ind w:start="709" w:hanging="283"/>
+      </w:pPr>
+      <w:rPr>
+        <w:rFonts w:ascii="Symbol" w:hAnsi="Symbol" w:cs="Symbol" w:hint="default"/>
+      </w:rPr>
+    </w:lvl>
+    <w:lvl w:ilvl="1">
+      <w:start w:val="1"/>
+      <w:numFmt w:val="bullet"/>
+      <w:lvlText w:val=""/>
+      <w:lvlJc w:val="start"/>
+      <w:pPr>
+        <w:tabs>
+          <w:tab w:val="num" w:pos="1418"/>
+        </w:tabs>
+        <w:ind w:start="1418" w:hanging="283"/>
+      </w:pPr>
+      <w:rPr>
+        <w:rFonts w:ascii="Symbol" w:hAnsi="Symbol" w:cs="Symbol" w:hint="default"/>
+      </w:rPr>
+    </w:lvl>
+    <w:lvl w:ilvl="2">
+      <w:start w:val="1"/>
+      <w:numFmt w:val="bullet"/>
+      <w:lvlText w:val=""/>
+      <w:lvlJc w:val="start"/>
+      <w:pPr>
+        <w:tabs>
+          <w:tab w:val="num" w:pos="2127"/>
+        </w:tabs>
+        <w:ind w:start="2127" w:hanging="283"/>
+      </w:pPr>
+      <w:rPr>
+        <w:rFonts w:ascii="Symbol" w:hAnsi="Symbol" w:cs="Symbol" w:hint="default"/>
+      </w:rPr>
+    </w:lvl>
+    <w:lvl w:ilvl="3">
+      <w:start w:val="1"/>
+      <w:numFmt w:val="bullet"/>
+      <w:lvlText w:val=""/>
+      <w:lvlJc w:val="start"/>
+      <w:pPr>
+        <w:tabs>
+          <w:tab w:val="num" w:pos="2836"/>
+        </w:tabs>
+        <w:ind w:start="2836" w:hanging="283"/>
+      </w:pPr>
+      <w:rPr>
+        <w:rFonts w:ascii="Symbol" w:hAnsi="Symbol" w:cs="Symbol" w:hint="default"/>
+      </w:rPr>
+    </w:lvl>
+    <w:lvl w:ilvl="4">
+      <w:start w:val="1"/>
+      <w:numFmt w:val="bullet"/>
+      <w:lvlText w:val=""/>
+      <w:lvlJc w:val="start"/>
+      <w:pPr>
+        <w:tabs>
+          <w:tab w:val="num" w:pos="3545"/>
+        </w:tabs>
+        <w:ind w:start="3545" w:hanging="283"/>
+      </w:pPr>
+      <w:rPr>
+        <w:rFonts w:ascii="Symbol" w:hAnsi="Symbol" w:cs="Symbol" w:hint="default"/>
+      </w:rPr>
+    </w:lvl>
+    <w:lvl w:ilvl="5">
+      <w:start w:val="1"/>
+      <w:numFmt w:val="bullet"/>
+      <w:lvlText w:val=""/>
+      <w:lvlJc w:val="start"/>
+      <w:pPr>
+        <w:tabs>
+          <w:tab w:val="num" w:pos="4254"/>
+        </w:tabs>
+        <w:ind w:start="4254" w:hanging="283"/>
+      </w:pPr>
+      <w:rPr>
+        <w:rFonts w:ascii="Symbol" w:hAnsi="Symbol" w:cs="Symbol" w:hint="default"/>
+      </w:rPr>
+    </w:lvl>
+    <w:lvl w:ilvl="6">
+      <w:start w:val="1"/>
+      <w:numFmt w:val="bullet"/>
+      <w:lvlText w:val=""/>
+      <w:lvlJc w:val="start"/>
+      <w:pPr>
+        <w:tabs>
+          <w:tab w:val="num" w:pos="4963"/>
+        </w:tabs>
+        <w:ind w:start="4963" w:hanging="283"/>
+      </w:pPr>
+      <w:rPr>
+        <w:rFonts w:ascii="Symbol" w:hAnsi="Symbol" w:cs="Symbol" w:hint="default"/>
+      </w:rPr>
+    </w:lvl>
+    <w:lvl w:ilvl="7">
+      <w:start w:val="1"/>
+      <w:numFmt w:val="bullet"/>
+      <w:lvlText w:val=""/>
+      <w:lvlJc w:val="start"/>
+      <w:pPr>
+        <w:tabs>
+          <w:tab w:val="num" w:pos="5672"/>
+        </w:tabs>
+        <w:ind w:start="5672" w:hanging="283"/>
+      </w:pPr>
+      <w:rPr>
+        <w:rFonts w:ascii="Symbol" w:hAnsi="Symbol" w:cs="Symbol" w:hint="default"/>
+      </w:rPr>
+    </w:lvl>
+    <w:lvl w:ilvl="8">
+      <w:start w:val="1"/>
+      <w:numFmt w:val="bullet"/>
+      <w:lvlText w:val=""/>
+      <w:lvlJc w:val="start"/>
+      <w:pPr>
+        <w:tabs>
+          <w:tab w:val="num" w:pos="6381"/>
+        </w:tabs>
+        <w:ind w:start="6381" w:hanging="283"/>
+      </w:pPr>
+      <w:rPr>
+        <w:rFonts w:ascii="Symbol" w:hAnsi="Symbol" w:cs="Symbol" w:hint="default"/>
+      </w:rPr>
+    </w:lvl>
+  </w:abstractNum>
+  <w:abstractNum w:abstractNumId="27">
+    <w:lvl w:ilvl="0">
+      <w:start w:val="1"/>
+      <w:numFmt w:val="bullet"/>
+      <w:lvlText w:val=""/>
+      <w:lvlJc w:val="start"/>
+      <w:pPr>
+        <w:tabs>
+          <w:tab w:val="num" w:pos="709"/>
+        </w:tabs>
+        <w:ind w:start="709" w:hanging="283"/>
+      </w:pPr>
+      <w:rPr>
+        <w:rFonts w:ascii="Symbol" w:hAnsi="Symbol" w:cs="Symbol" w:hint="default"/>
+      </w:rPr>
+    </w:lvl>
+    <w:lvl w:ilvl="1">
+      <w:start w:val="1"/>
+      <w:numFmt w:val="bullet"/>
+      <w:lvlText w:val=""/>
+      <w:lvlJc w:val="start"/>
+      <w:pPr>
+        <w:tabs>
+          <w:tab w:val="num" w:pos="1418"/>
+        </w:tabs>
+        <w:ind w:start="1418" w:hanging="283"/>
+      </w:pPr>
+      <w:rPr>
+        <w:rFonts w:ascii="Symbol" w:hAnsi="Symbol" w:cs="Symbol" w:hint="default"/>
+      </w:rPr>
+    </w:lvl>
+    <w:lvl w:ilvl="2">
+      <w:start w:val="1"/>
+      <w:numFmt w:val="bullet"/>
+      <w:lvlText w:val=""/>
+      <w:lvlJc w:val="start"/>
+      <w:pPr>
+        <w:tabs>
+          <w:tab w:val="num" w:pos="2127"/>
+        </w:tabs>
+        <w:ind w:start="2127" w:hanging="283"/>
+      </w:pPr>
+      <w:rPr>
+        <w:rFonts w:ascii="Symbol" w:hAnsi="Symbol" w:cs="Symbol" w:hint="default"/>
+      </w:rPr>
+    </w:lvl>
+    <w:lvl w:ilvl="3">
+      <w:start w:val="1"/>
+      <w:numFmt w:val="bullet"/>
+      <w:lvlText w:val=""/>
+      <w:lvlJc w:val="start"/>
+      <w:pPr>
+        <w:tabs>
+          <w:tab w:val="num" w:pos="2836"/>
+        </w:tabs>
+        <w:ind w:start="2836" w:hanging="283"/>
+      </w:pPr>
+      <w:rPr>
+        <w:rFonts w:ascii="Symbol" w:hAnsi="Symbol" w:cs="Symbol" w:hint="default"/>
+      </w:rPr>
+    </w:lvl>
+    <w:lvl w:ilvl="4">
+      <w:start w:val="1"/>
+      <w:numFmt w:val="bullet"/>
+      <w:lvlText w:val=""/>
+      <w:lvlJc w:val="start"/>
+      <w:pPr>
+        <w:tabs>
+          <w:tab w:val="num" w:pos="3545"/>
+        </w:tabs>
+        <w:ind w:start="3545" w:hanging="283"/>
+      </w:pPr>
+      <w:rPr>
+        <w:rFonts w:ascii="Symbol" w:hAnsi="Symbol" w:cs="Symbol" w:hint="default"/>
+      </w:rPr>
+    </w:lvl>
+    <w:lvl w:ilvl="5">
+      <w:start w:val="1"/>
+      <w:numFmt w:val="bullet"/>
+      <w:lvlText w:val=""/>
+      <w:lvlJc w:val="start"/>
+      <w:pPr>
+        <w:tabs>
+          <w:tab w:val="num" w:pos="4254"/>
+        </w:tabs>
+        <w:ind w:start="4254" w:hanging="283"/>
+      </w:pPr>
+      <w:rPr>
+        <w:rFonts w:ascii="Symbol" w:hAnsi="Symbol" w:cs="Symbol" w:hint="default"/>
+      </w:rPr>
+    </w:lvl>
+    <w:lvl w:ilvl="6">
+      <w:start w:val="1"/>
+      <w:numFmt w:val="bullet"/>
+      <w:lvlText w:val=""/>
+      <w:lvlJc w:val="start"/>
+      <w:pPr>
+        <w:tabs>
+          <w:tab w:val="num" w:pos="4963"/>
+        </w:tabs>
+        <w:ind w:start="4963" w:hanging="283"/>
+      </w:pPr>
+      <w:rPr>
+        <w:rFonts w:ascii="Symbol" w:hAnsi="Symbol" w:cs="Symbol" w:hint="default"/>
+      </w:rPr>
+    </w:lvl>
+    <w:lvl w:ilvl="7">
+      <w:start w:val="1"/>
+      <w:numFmt w:val="bullet"/>
+      <w:lvlText w:val=""/>
+      <w:lvlJc w:val="start"/>
+      <w:pPr>
+        <w:tabs>
+          <w:tab w:val="num" w:pos="5672"/>
+        </w:tabs>
+        <w:ind w:start="5672" w:hanging="283"/>
+      </w:pPr>
+      <w:rPr>
+        <w:rFonts w:ascii="Symbol" w:hAnsi="Symbol" w:cs="Symbol" w:hint="default"/>
+      </w:rPr>
+    </w:lvl>
+    <w:lvl w:ilvl="8">
+      <w:start w:val="1"/>
+      <w:numFmt w:val="bullet"/>
+      <w:lvlText w:val=""/>
+      <w:lvlJc w:val="start"/>
+      <w:pPr>
+        <w:tabs>
+          <w:tab w:val="num" w:pos="6381"/>
+        </w:tabs>
+        <w:ind w:start="6381" w:hanging="283"/>
+      </w:pPr>
+      <w:rPr>
+        <w:rFonts w:ascii="Symbol" w:hAnsi="Symbol" w:cs="Symbol" w:hint="default"/>
+      </w:rPr>
+    </w:lvl>
+  </w:abstractNum>
+  <w:abstractNum w:abstractNumId="28">
     <w:lvl w:ilvl="0">
       <w:start w:val="1"/>
       <w:numFmt w:val="none"/>
@@ -9587,6 +12296,12 @@
   <w:num w:numId="26">
     <w:abstractNumId w:val="26"/>
   </w:num>
+  <w:num w:numId="27">
+    <w:abstractNumId w:val="27"/>
+  </w:num>
+  <w:num w:numId="28">
+    <w:abstractNumId w:val="28"/>
+  </w:num>
 </w:numbering>
 </file>
 
@@ -9629,7 +12344,7 @@
   </w:style>
   <w:style w:type="paragraph" w:styleId="Heading1">
     <w:name w:val="heading 1"/>
-    <w:basedOn w:val="Ttulo"/>
+    <w:basedOn w:val="Ttulouser"/>
     <w:next w:val="BodyText"/>
     <w:qFormat/>
     <w:pPr>
@@ -9649,7 +12364,7 @@
   </w:style>
   <w:style w:type="paragraph" w:styleId="Heading2">
     <w:name w:val="heading 2"/>
-    <w:basedOn w:val="Ttulouser"/>
+    <w:basedOn w:val="Ttulo"/>
     <w:next w:val="BodyText"/>
     <w:qFormat/>
     <w:pPr>
@@ -9669,7 +12384,7 @@
   </w:style>
   <w:style w:type="paragraph" w:styleId="Heading3">
     <w:name w:val="heading 3"/>
-    <w:basedOn w:val="Ttulo"/>
+    <w:basedOn w:val="Ttulouser"/>
     <w:next w:val="BodyText"/>
     <w:qFormat/>
     <w:pPr>
@@ -9684,8 +12399,8 @@
       <w:szCs w:val="28"/>
     </w:rPr>
   </w:style>
-  <w:style w:type="character" w:styleId="Textooriginal">
-    <w:name w:val="Texto original"/>
+  <w:style w:type="character" w:styleId="Textooriginaluser">
+    <w:name w:val="Texto original (user)"/>
     <w:qFormat/>
     <w:rPr>
       <w:rFonts w:ascii="Liberation Mono" w:hAnsi="Liberation Mono" w:eastAsia="NSimSun" w:cs="Liberation Mono"/>
@@ -9699,8 +12414,8 @@
       <w:bCs/>
     </w:rPr>
   </w:style>
-  <w:style w:type="character" w:styleId="Bolos">
-    <w:name w:val="Bolos"/>
+  <w:style w:type="character" w:styleId="Bolosuser">
+    <w:name w:val="Bolos (user)"/>
     <w:qFormat/>
     <w:rPr>
       <w:rFonts w:ascii="OpenSymbol" w:hAnsi="OpenSymbol" w:eastAsia="OpenSymbol" w:cs="OpenSymbol"/>
@@ -9714,37 +12429,37 @@
       <w:iCs/>
     </w:rPr>
   </w:style>
+  <w:style w:type="character" w:styleId="Smbolosdenumeracinuser">
+    <w:name w:val="Símbolos de numeración (user)"/>
+    <w:qFormat/>
+    <w:rPr/>
+  </w:style>
+  <w:style w:type="character" w:styleId="Textooriginal">
+    <w:name w:val="Texto original"/>
+    <w:qFormat/>
+    <w:rPr>
+      <w:rFonts w:ascii="Liberation Mono" w:hAnsi="Liberation Mono" w:eastAsia="NSimSun" w:cs="Liberation Mono"/>
+    </w:rPr>
+  </w:style>
   <w:style w:type="character" w:styleId="Smbolosdenumeracin">
     <w:name w:val="Símbolos de numeración"/>
     <w:qFormat/>
     <w:rPr/>
   </w:style>
-  <w:style w:type="character" w:styleId="Textooriginaluser">
-    <w:name w:val="Texto original (user)"/>
-    <w:qFormat/>
-    <w:rPr>
-      <w:rFonts w:ascii="Liberation Mono" w:hAnsi="Liberation Mono" w:eastAsia="NSimSun" w:cs="Liberation Mono"/>
-    </w:rPr>
-  </w:style>
-  <w:style w:type="character" w:styleId="Smbolosdenumeracinuser">
-    <w:name w:val="Símbolos de numeración (user)"/>
-    <w:qFormat/>
-    <w:rPr/>
-  </w:style>
-  <w:style w:type="character" w:styleId="Bolosuser">
-    <w:name w:val="Bolos (user)"/>
+  <w:style w:type="character" w:styleId="Bolos">
+    <w:name w:val="Bolos"/>
     <w:qFormat/>
     <w:rPr>
       <w:rFonts w:ascii="OpenSymbol" w:hAnsi="OpenSymbol" w:eastAsia="OpenSymbol" w:cs="OpenSymbol"/>
     </w:rPr>
   </w:style>
-  <w:style w:type="character" w:styleId="Caracteresdenotaalpie">
-    <w:name w:val="Caracteres de nota al pie"/>
+  <w:style w:type="character" w:styleId="Caracteresdenotaalpieuser">
+    <w:name w:val="Caracteres de nota al pie (user)"/>
     <w:qFormat/>
     <w:rPr/>
   </w:style>
-  <w:style w:type="character" w:styleId="Caracteresdenotafinal">
-    <w:name w:val="Caracteres de nota final"/>
+  <w:style w:type="character" w:styleId="Caracteresdenotafinaluser">
+    <w:name w:val="Caracteres de nota final (user)"/>
     <w:qFormat/>
     <w:rPr/>
   </w:style>
@@ -9846,8 +12561,8 @@
       <w:rFonts w:cs="Arial"/>
     </w:rPr>
   </w:style>
-  <w:style w:type="paragraph" w:styleId="Textopreformateado">
-    <w:name w:val="Texto preformateado"/>
+  <w:style w:type="paragraph" w:styleId="Textopreformateadouser">
+    <w:name w:val="Texto preformateado (user)"/>
     <w:basedOn w:val="Normal"/>
     <w:qFormat/>
     <w:pPr>
@@ -9857,6 +12572,29 @@
       <w:rFonts w:ascii="Liberation Mono" w:hAnsi="Liberation Mono" w:eastAsia="NSimSun" w:cs="Liberation Mono"/>
       <w:sz w:val="20"/>
       <w:szCs w:val="20"/>
+    </w:rPr>
+  </w:style>
+  <w:style w:type="paragraph" w:styleId="Contenidodelatablauser">
+    <w:name w:val="Contenido de la tabla (user)"/>
+    <w:basedOn w:val="Normal"/>
+    <w:qFormat/>
+    <w:pPr>
+      <w:widowControl w:val="false"/>
+      <w:suppressLineNumbers/>
+    </w:pPr>
+    <w:rPr/>
+  </w:style>
+  <w:style w:type="paragraph" w:styleId="Ttulodelatablauser">
+    <w:name w:val="Título de la tabla (user)"/>
+    <w:basedOn w:val="Contenidodelatablauser"/>
+    <w:qFormat/>
+    <w:pPr>
+      <w:suppressLineNumbers/>
+      <w:jc w:val="center"/>
+    </w:pPr>
+    <w:rPr>
+      <w:b/>
+      <w:bCs/>
     </w:rPr>
   </w:style>
   <w:style w:type="paragraph" w:styleId="Contenidodelatabla">
@@ -9882,27 +12620,21 @@
       <w:bCs/>
     </w:rPr>
   </w:style>
-  <w:style w:type="paragraph" w:styleId="Contenidodelatablauser">
-    <w:name w:val="Contenido de la tabla (user)"/>
+  <w:style w:type="paragraph" w:styleId="Lneahorizontal">
+    <w:name w:val="Línea horizontal"/>
     <w:basedOn w:val="Normal"/>
-    <w:qFormat/>
-    <w:pPr>
-      <w:widowControl w:val="false"/>
-      <w:suppressLineNumbers/>
-    </w:pPr>
-    <w:rPr/>
-  </w:style>
-  <w:style w:type="paragraph" w:styleId="Ttulodelatablauser">
-    <w:name w:val="Título de la tabla (user)"/>
-    <w:basedOn w:val="Contenidodelatablauser"/>
+    <w:next w:val="BodyText"/>
     <w:qFormat/>
     <w:pPr>
       <w:suppressLineNumbers/>
-      <w:jc w:val="center"/>
+      <w:pBdr>
+        <w:bottom w:val="double" w:sz="2" w:space="0" w:color="808080"/>
+      </w:pBdr>
+      <w:spacing w:before="0" w:after="283"/>
     </w:pPr>
     <w:rPr>
-      <w:b/>
-      <w:bCs/>
+      <w:sz w:val="12"/>
+      <w:szCs w:val="12"/>
     </w:rPr>
   </w:style>
   <w:style w:type="paragraph" w:styleId="Lneahorizontaluser">
@@ -9922,25 +12654,8 @@
       <w:szCs w:val="12"/>
     </w:rPr>
   </w:style>
-  <w:style w:type="paragraph" w:styleId="Lneahorizontal">
-    <w:name w:val="Línea horizontal"/>
-    <w:basedOn w:val="Normal"/>
-    <w:next w:val="BodyText"/>
-    <w:qFormat/>
-    <w:pPr>
-      <w:suppressLineNumbers/>
-      <w:pBdr>
-        <w:bottom w:val="double" w:sz="2" w:space="0" w:color="808080"/>
-      </w:pBdr>
-      <w:spacing w:before="0" w:after="283"/>
-    </w:pPr>
-    <w:rPr>
-      <w:sz w:val="12"/>
-      <w:szCs w:val="12"/>
-    </w:rPr>
-  </w:style>
-  <w:style w:type="paragraph" w:styleId="Textopreformateadouser">
-    <w:name w:val="Texto preformateado (user)"/>
+  <w:style w:type="paragraph" w:styleId="Textopreformateado">
+    <w:name w:val="Texto preformateado"/>
     <w:basedOn w:val="Normal"/>
     <w:qFormat/>
     <w:pPr>
@@ -9952,8 +12667,8 @@
       <w:szCs w:val="20"/>
     </w:rPr>
   </w:style>
-  <w:style w:type="paragraph" w:styleId="Contenidodelista">
-    <w:name w:val="Contenido de lista"/>
+  <w:style w:type="paragraph" w:styleId="Contenidodelistauser">
+    <w:name w:val="Contenido de lista (user)"/>
     <w:basedOn w:val="Normal"/>
     <w:qFormat/>
     <w:pPr>

</xml_diff>